<commit_message>
docs(phase07): polish Sprint 2 report layout
</commit_message>
<xml_diff>
--- a/draft/fraud-detection/reports/[Nhom9]_BaoCao_FraudDetection_Sprint2_Duy.docx
+++ b/draft/fraud-detection/reports/[Nhom9]_BaoCao_FraudDetection_Sprint2_Duy.docx
@@ -686,42 +686,1293 @@
         <w:t>MỤC LỤC</w:t>
       </w:r>
     </w:p>
-    <w:p>
-      <w:pPr>
-        <w:ind w:firstLine="567"/>
-        <w:jc w:val="both"/>
-      </w:pPr>
-      <w:r>
-        <w:rPr>
-          <w:rFonts w:ascii="Times New Roman" w:hAnsi="Times New Roman" w:eastAsia="Times New Roman"/>
-        </w:rPr>
-        <w:fldChar w:fldCharType="begin"/>
-      </w:r>
-      <w:r>
-        <w:rPr>
-          <w:rFonts w:ascii="Times New Roman" w:hAnsi="Times New Roman" w:eastAsia="Times New Roman"/>
-        </w:rPr>
-        <w:instrText xml:space="preserve"> TOC \o "1-3" \h \z \u </w:instrText>
-      </w:r>
-      <w:r>
-        <w:rPr>
-          <w:rFonts w:ascii="Times New Roman" w:hAnsi="Times New Roman" w:eastAsia="Times New Roman"/>
-        </w:rPr>
-        <w:fldChar w:fldCharType="separate"/>
-      </w:r>
-      <w:r>
-        <w:rPr>
-          <w:rFonts w:ascii="Times New Roman" w:hAnsi="Times New Roman" w:eastAsia="Times New Roman"/>
-        </w:rPr>
-        <w:t>Mục lục sẽ được cập nhật khi mở file trong Word (References → Update Table).</w:t>
-      </w:r>
-      <w:r>
-        <w:rPr>
-          <w:rFonts w:ascii="Times New Roman" w:hAnsi="Times New Roman" w:eastAsia="Times New Roman"/>
-        </w:rPr>
-        <w:fldChar w:fldCharType="end"/>
-      </w:r>
-    </w:p>
+    <w:tbl>
+      <w:tblPr>
+        <w:tblW w:type="auto" w:w="0"/>
+        <w:tblLayout w:type="fixed"/>
+        <w:tblLook w:firstColumn="1" w:firstRow="1" w:lastColumn="0" w:lastRow="0" w:noHBand="0" w:noVBand="1" w:val="04A0"/>
+        <w:tblBorders>
+          <w:top w:val="nil"/>
+          <w:left w:val="nil"/>
+          <w:bottom w:val="nil"/>
+          <w:right w:val="nil"/>
+          <w:insideH w:val="nil"/>
+          <w:insideV w:val="nil"/>
+        </w:tblBorders>
+      </w:tblPr>
+      <w:tblGrid>
+        <w:gridCol w:w="8712"/>
+        <w:gridCol w:w="648"/>
+      </w:tblGrid>
+      <w:tr>
+        <w:trPr>
+          <w:cantSplit/>
+        </w:trPr>
+        <w:tc>
+          <w:tcPr>
+            <w:tcW w:type="dxa" w:w="8712"/>
+            <w:vAlign w:val="center"/>
+            <w:tcMar>
+              <w:top w:w="35" w:type="dxa"/>
+              <w:bottom w:w="35" w:type="dxa"/>
+              <w:left w:w="35" w:type="dxa"/>
+              <w:right w:w="35" w:type="dxa"/>
+            </w:tcMar>
+          </w:tcPr>
+          <w:p>
+            <w:pPr>
+              <w:keepLines/>
+              <w:spacing w:before="60" w:after="0" w:line="240" w:lineRule="auto"/>
+              <w:ind w:left="0"/>
+              <w:jc w:val="left"/>
+            </w:pPr>
+            <w:r>
+              <w:rPr>
+                <w:rFonts w:ascii="Times New Roman" w:hAnsi="Times New Roman"/>
+                <w:b/>
+                <w:color w:val="365F91"/>
+                <w:sz w:val="22"/>
+              </w:rPr>
+              <w:t>CHƯƠNG 1. GIỚI THIỆU</w:t>
+            </w:r>
+          </w:p>
+        </w:tc>
+        <w:tc>
+          <w:tcPr>
+            <w:tcW w:type="dxa" w:w="648"/>
+            <w:vAlign w:val="center"/>
+            <w:tcMar>
+              <w:top w:w="35" w:type="dxa"/>
+              <w:bottom w:w="35" w:type="dxa"/>
+              <w:left w:w="35" w:type="dxa"/>
+              <w:right w:w="35" w:type="dxa"/>
+            </w:tcMar>
+          </w:tcPr>
+          <w:p>
+            <w:pPr>
+              <w:keepLines/>
+              <w:spacing w:before="60" w:after="0" w:line="240" w:lineRule="auto"/>
+              <w:jc w:val="right"/>
+            </w:pPr>
+            <w:r>
+              <w:rPr>
+                <w:rFonts w:ascii="Times New Roman" w:hAnsi="Times New Roman"/>
+                <w:b/>
+                <w:color w:val="365F91"/>
+                <w:sz w:val="22"/>
+              </w:rPr>
+              <w:t>3</w:t>
+            </w:r>
+          </w:p>
+        </w:tc>
+      </w:tr>
+      <w:tr>
+        <w:trPr>
+          <w:cantSplit/>
+        </w:trPr>
+        <w:tc>
+          <w:tcPr>
+            <w:tcW w:type="dxa" w:w="8712"/>
+            <w:vAlign w:val="center"/>
+            <w:tcMar>
+              <w:top w:w="35" w:type="dxa"/>
+              <w:bottom w:w="35" w:type="dxa"/>
+              <w:left w:w="35" w:type="dxa"/>
+              <w:right w:w="35" w:type="dxa"/>
+            </w:tcMar>
+          </w:tcPr>
+          <w:p>
+            <w:pPr>
+              <w:keepLines/>
+              <w:spacing w:before="0" w:after="0" w:line="240" w:lineRule="auto"/>
+              <w:ind w:left="280"/>
+              <w:jc w:val="left"/>
+            </w:pPr>
+            <w:r>
+              <w:rPr>
+                <w:rFonts w:ascii="Times New Roman" w:hAnsi="Times New Roman"/>
+                <w:b w:val="0"/>
+                <w:sz w:val="22"/>
+              </w:rPr>
+              <w:t>1.1. Bối cảnh</w:t>
+            </w:r>
+          </w:p>
+        </w:tc>
+        <w:tc>
+          <w:tcPr>
+            <w:tcW w:type="dxa" w:w="648"/>
+            <w:vAlign w:val="center"/>
+            <w:tcMar>
+              <w:top w:w="35" w:type="dxa"/>
+              <w:bottom w:w="35" w:type="dxa"/>
+              <w:left w:w="35" w:type="dxa"/>
+              <w:right w:w="35" w:type="dxa"/>
+            </w:tcMar>
+          </w:tcPr>
+          <w:p>
+            <w:pPr>
+              <w:keepLines/>
+              <w:spacing w:before="0" w:after="0" w:line="240" w:lineRule="auto"/>
+              <w:jc w:val="right"/>
+            </w:pPr>
+            <w:r>
+              <w:rPr>
+                <w:rFonts w:ascii="Times New Roman" w:hAnsi="Times New Roman"/>
+                <w:b w:val="0"/>
+                <w:sz w:val="22"/>
+              </w:rPr>
+              <w:t>3</w:t>
+            </w:r>
+          </w:p>
+        </w:tc>
+      </w:tr>
+      <w:tr>
+        <w:trPr>
+          <w:cantSplit/>
+        </w:trPr>
+        <w:tc>
+          <w:tcPr>
+            <w:tcW w:type="dxa" w:w="8712"/>
+            <w:vAlign w:val="center"/>
+            <w:tcMar>
+              <w:top w:w="35" w:type="dxa"/>
+              <w:bottom w:w="35" w:type="dxa"/>
+              <w:left w:w="35" w:type="dxa"/>
+              <w:right w:w="35" w:type="dxa"/>
+            </w:tcMar>
+          </w:tcPr>
+          <w:p>
+            <w:pPr>
+              <w:keepLines/>
+              <w:spacing w:before="0" w:after="0" w:line="240" w:lineRule="auto"/>
+              <w:ind w:left="280"/>
+              <w:jc w:val="left"/>
+            </w:pPr>
+            <w:r>
+              <w:rPr>
+                <w:rFonts w:ascii="Times New Roman" w:hAnsi="Times New Roman"/>
+                <w:b w:val="0"/>
+                <w:sz w:val="22"/>
+              </w:rPr>
+              <w:t>1.2. Lý do chọn đề tài</w:t>
+            </w:r>
+          </w:p>
+        </w:tc>
+        <w:tc>
+          <w:tcPr>
+            <w:tcW w:type="dxa" w:w="648"/>
+            <w:vAlign w:val="center"/>
+            <w:tcMar>
+              <w:top w:w="35" w:type="dxa"/>
+              <w:bottom w:w="35" w:type="dxa"/>
+              <w:left w:w="35" w:type="dxa"/>
+              <w:right w:w="35" w:type="dxa"/>
+            </w:tcMar>
+          </w:tcPr>
+          <w:p>
+            <w:pPr>
+              <w:keepLines/>
+              <w:spacing w:before="0" w:after="0" w:line="240" w:lineRule="auto"/>
+              <w:jc w:val="right"/>
+            </w:pPr>
+            <w:r>
+              <w:rPr>
+                <w:rFonts w:ascii="Times New Roman" w:hAnsi="Times New Roman"/>
+                <w:b w:val="0"/>
+                <w:sz w:val="22"/>
+              </w:rPr>
+              <w:t>3</w:t>
+            </w:r>
+          </w:p>
+        </w:tc>
+      </w:tr>
+      <w:tr>
+        <w:trPr>
+          <w:cantSplit/>
+        </w:trPr>
+        <w:tc>
+          <w:tcPr>
+            <w:tcW w:type="dxa" w:w="8712"/>
+            <w:vAlign w:val="center"/>
+            <w:tcMar>
+              <w:top w:w="35" w:type="dxa"/>
+              <w:bottom w:w="35" w:type="dxa"/>
+              <w:left w:w="35" w:type="dxa"/>
+              <w:right w:w="35" w:type="dxa"/>
+            </w:tcMar>
+          </w:tcPr>
+          <w:p>
+            <w:pPr>
+              <w:keepLines/>
+              <w:spacing w:before="0" w:after="0" w:line="240" w:lineRule="auto"/>
+              <w:ind w:left="280"/>
+              <w:jc w:val="left"/>
+            </w:pPr>
+            <w:r>
+              <w:rPr>
+                <w:rFonts w:ascii="Times New Roman" w:hAnsi="Times New Roman"/>
+                <w:b w:val="0"/>
+                <w:sz w:val="22"/>
+              </w:rPr>
+              <w:t>1.3. Mục tiêu đề tài</w:t>
+            </w:r>
+          </w:p>
+        </w:tc>
+        <w:tc>
+          <w:tcPr>
+            <w:tcW w:type="dxa" w:w="648"/>
+            <w:vAlign w:val="center"/>
+            <w:tcMar>
+              <w:top w:w="35" w:type="dxa"/>
+              <w:bottom w:w="35" w:type="dxa"/>
+              <w:left w:w="35" w:type="dxa"/>
+              <w:right w:w="35" w:type="dxa"/>
+            </w:tcMar>
+          </w:tcPr>
+          <w:p>
+            <w:pPr>
+              <w:keepLines/>
+              <w:spacing w:before="0" w:after="0" w:line="240" w:lineRule="auto"/>
+              <w:jc w:val="right"/>
+            </w:pPr>
+            <w:r>
+              <w:rPr>
+                <w:rFonts w:ascii="Times New Roman" w:hAnsi="Times New Roman"/>
+                <w:b w:val="0"/>
+                <w:sz w:val="22"/>
+              </w:rPr>
+              <w:t>4</w:t>
+            </w:r>
+          </w:p>
+        </w:tc>
+      </w:tr>
+      <w:tr>
+        <w:trPr>
+          <w:cantSplit/>
+        </w:trPr>
+        <w:tc>
+          <w:tcPr>
+            <w:tcW w:type="dxa" w:w="8712"/>
+            <w:vAlign w:val="center"/>
+            <w:tcMar>
+              <w:top w:w="35" w:type="dxa"/>
+              <w:bottom w:w="35" w:type="dxa"/>
+              <w:left w:w="35" w:type="dxa"/>
+              <w:right w:w="35" w:type="dxa"/>
+            </w:tcMar>
+          </w:tcPr>
+          <w:p>
+            <w:pPr>
+              <w:keepLines/>
+              <w:spacing w:before="0" w:after="0" w:line="240" w:lineRule="auto"/>
+              <w:ind w:left="280"/>
+              <w:jc w:val="left"/>
+            </w:pPr>
+            <w:r>
+              <w:rPr>
+                <w:rFonts w:ascii="Times New Roman" w:hAnsi="Times New Roman"/>
+                <w:b w:val="0"/>
+                <w:sz w:val="22"/>
+              </w:rPr>
+              <w:t>1.4. Đối tượng và phạm vi nghiên cứu</w:t>
+            </w:r>
+          </w:p>
+        </w:tc>
+        <w:tc>
+          <w:tcPr>
+            <w:tcW w:type="dxa" w:w="648"/>
+            <w:vAlign w:val="center"/>
+            <w:tcMar>
+              <w:top w:w="35" w:type="dxa"/>
+              <w:bottom w:w="35" w:type="dxa"/>
+              <w:left w:w="35" w:type="dxa"/>
+              <w:right w:w="35" w:type="dxa"/>
+            </w:tcMar>
+          </w:tcPr>
+          <w:p>
+            <w:pPr>
+              <w:keepLines/>
+              <w:spacing w:before="0" w:after="0" w:line="240" w:lineRule="auto"/>
+              <w:jc w:val="right"/>
+            </w:pPr>
+            <w:r>
+              <w:rPr>
+                <w:rFonts w:ascii="Times New Roman" w:hAnsi="Times New Roman"/>
+                <w:b w:val="0"/>
+                <w:sz w:val="22"/>
+              </w:rPr>
+              <w:t>4</w:t>
+            </w:r>
+          </w:p>
+        </w:tc>
+      </w:tr>
+      <w:tr>
+        <w:trPr>
+          <w:cantSplit/>
+        </w:trPr>
+        <w:tc>
+          <w:tcPr>
+            <w:tcW w:type="dxa" w:w="8712"/>
+            <w:vAlign w:val="center"/>
+            <w:tcMar>
+              <w:top w:w="35" w:type="dxa"/>
+              <w:bottom w:w="35" w:type="dxa"/>
+              <w:left w:w="35" w:type="dxa"/>
+              <w:right w:w="35" w:type="dxa"/>
+            </w:tcMar>
+          </w:tcPr>
+          <w:p>
+            <w:pPr>
+              <w:keepLines/>
+              <w:spacing w:before="0" w:after="0" w:line="240" w:lineRule="auto"/>
+              <w:ind w:left="280"/>
+              <w:jc w:val="left"/>
+            </w:pPr>
+            <w:r>
+              <w:rPr>
+                <w:rFonts w:ascii="Times New Roman" w:hAnsi="Times New Roman"/>
+                <w:b w:val="0"/>
+                <w:sz w:val="22"/>
+              </w:rPr>
+              <w:t>1.5. Cấu trúc báo cáo dự kiến</w:t>
+            </w:r>
+          </w:p>
+        </w:tc>
+        <w:tc>
+          <w:tcPr>
+            <w:tcW w:type="dxa" w:w="648"/>
+            <w:vAlign w:val="center"/>
+            <w:tcMar>
+              <w:top w:w="35" w:type="dxa"/>
+              <w:bottom w:w="35" w:type="dxa"/>
+              <w:left w:w="35" w:type="dxa"/>
+              <w:right w:w="35" w:type="dxa"/>
+            </w:tcMar>
+          </w:tcPr>
+          <w:p>
+            <w:pPr>
+              <w:keepLines/>
+              <w:spacing w:before="0" w:after="0" w:line="240" w:lineRule="auto"/>
+              <w:jc w:val="right"/>
+            </w:pPr>
+            <w:r>
+              <w:rPr>
+                <w:rFonts w:ascii="Times New Roman" w:hAnsi="Times New Roman"/>
+                <w:b w:val="0"/>
+                <w:sz w:val="22"/>
+              </w:rPr>
+              <w:t>5</w:t>
+            </w:r>
+          </w:p>
+        </w:tc>
+      </w:tr>
+      <w:tr>
+        <w:trPr>
+          <w:cantSplit/>
+        </w:trPr>
+        <w:tc>
+          <w:tcPr>
+            <w:tcW w:type="dxa" w:w="8712"/>
+            <w:vAlign w:val="center"/>
+            <w:tcMar>
+              <w:top w:w="35" w:type="dxa"/>
+              <w:bottom w:w="35" w:type="dxa"/>
+              <w:left w:w="35" w:type="dxa"/>
+              <w:right w:w="35" w:type="dxa"/>
+            </w:tcMar>
+          </w:tcPr>
+          <w:p>
+            <w:pPr>
+              <w:keepLines/>
+              <w:spacing w:before="60" w:after="0" w:line="240" w:lineRule="auto"/>
+              <w:ind w:left="0"/>
+              <w:jc w:val="left"/>
+            </w:pPr>
+            <w:r>
+              <w:rPr>
+                <w:rFonts w:ascii="Times New Roman" w:hAnsi="Times New Roman"/>
+                <w:b/>
+                <w:color w:val="365F91"/>
+                <w:sz w:val="22"/>
+              </w:rPr>
+              <w:t>CHƯƠNG 2. PHÁT BIỂU BÀI TOÁN</w:t>
+            </w:r>
+          </w:p>
+        </w:tc>
+        <w:tc>
+          <w:tcPr>
+            <w:tcW w:type="dxa" w:w="648"/>
+            <w:vAlign w:val="center"/>
+            <w:tcMar>
+              <w:top w:w="35" w:type="dxa"/>
+              <w:bottom w:w="35" w:type="dxa"/>
+              <w:left w:w="35" w:type="dxa"/>
+              <w:right w:w="35" w:type="dxa"/>
+            </w:tcMar>
+          </w:tcPr>
+          <w:p>
+            <w:pPr>
+              <w:keepLines/>
+              <w:spacing w:before="60" w:after="0" w:line="240" w:lineRule="auto"/>
+              <w:jc w:val="right"/>
+            </w:pPr>
+            <w:r>
+              <w:rPr>
+                <w:rFonts w:ascii="Times New Roman" w:hAnsi="Times New Roman"/>
+                <w:b/>
+                <w:color w:val="365F91"/>
+                <w:sz w:val="22"/>
+              </w:rPr>
+              <w:t>6</w:t>
+            </w:r>
+          </w:p>
+        </w:tc>
+      </w:tr>
+      <w:tr>
+        <w:trPr>
+          <w:cantSplit/>
+        </w:trPr>
+        <w:tc>
+          <w:tcPr>
+            <w:tcW w:type="dxa" w:w="8712"/>
+            <w:vAlign w:val="center"/>
+            <w:tcMar>
+              <w:top w:w="35" w:type="dxa"/>
+              <w:bottom w:w="35" w:type="dxa"/>
+              <w:left w:w="35" w:type="dxa"/>
+              <w:right w:w="35" w:type="dxa"/>
+            </w:tcMar>
+          </w:tcPr>
+          <w:p>
+            <w:pPr>
+              <w:keepLines/>
+              <w:spacing w:before="0" w:after="0" w:line="240" w:lineRule="auto"/>
+              <w:ind w:left="280"/>
+              <w:jc w:val="left"/>
+            </w:pPr>
+            <w:r>
+              <w:rPr>
+                <w:rFonts w:ascii="Times New Roman" w:hAnsi="Times New Roman"/>
+                <w:b w:val="0"/>
+                <w:sz w:val="22"/>
+              </w:rPr>
+              <w:t>2.1. Mô tả bài toán</w:t>
+            </w:r>
+          </w:p>
+        </w:tc>
+        <w:tc>
+          <w:tcPr>
+            <w:tcW w:type="dxa" w:w="648"/>
+            <w:vAlign w:val="center"/>
+            <w:tcMar>
+              <w:top w:w="35" w:type="dxa"/>
+              <w:bottom w:w="35" w:type="dxa"/>
+              <w:left w:w="35" w:type="dxa"/>
+              <w:right w:w="35" w:type="dxa"/>
+            </w:tcMar>
+          </w:tcPr>
+          <w:p>
+            <w:pPr>
+              <w:keepLines/>
+              <w:spacing w:before="0" w:after="0" w:line="240" w:lineRule="auto"/>
+              <w:jc w:val="right"/>
+            </w:pPr>
+            <w:r>
+              <w:rPr>
+                <w:rFonts w:ascii="Times New Roman" w:hAnsi="Times New Roman"/>
+                <w:b w:val="0"/>
+                <w:sz w:val="22"/>
+              </w:rPr>
+              <w:t>6</w:t>
+            </w:r>
+          </w:p>
+        </w:tc>
+      </w:tr>
+      <w:tr>
+        <w:trPr>
+          <w:cantSplit/>
+        </w:trPr>
+        <w:tc>
+          <w:tcPr>
+            <w:tcW w:type="dxa" w:w="8712"/>
+            <w:vAlign w:val="center"/>
+            <w:tcMar>
+              <w:top w:w="35" w:type="dxa"/>
+              <w:bottom w:w="35" w:type="dxa"/>
+              <w:left w:w="35" w:type="dxa"/>
+              <w:right w:w="35" w:type="dxa"/>
+            </w:tcMar>
+          </w:tcPr>
+          <w:p>
+            <w:pPr>
+              <w:keepLines/>
+              <w:spacing w:before="0" w:after="0" w:line="240" w:lineRule="auto"/>
+              <w:ind w:left="280"/>
+              <w:jc w:val="left"/>
+            </w:pPr>
+            <w:r>
+              <w:rPr>
+                <w:rFonts w:ascii="Times New Roman" w:hAnsi="Times New Roman"/>
+                <w:b w:val="0"/>
+                <w:sz w:val="22"/>
+              </w:rPr>
+              <w:t>2.2. Đầu vào và đầu ra</w:t>
+            </w:r>
+          </w:p>
+        </w:tc>
+        <w:tc>
+          <w:tcPr>
+            <w:tcW w:type="dxa" w:w="648"/>
+            <w:vAlign w:val="center"/>
+            <w:tcMar>
+              <w:top w:w="35" w:type="dxa"/>
+              <w:bottom w:w="35" w:type="dxa"/>
+              <w:left w:w="35" w:type="dxa"/>
+              <w:right w:w="35" w:type="dxa"/>
+            </w:tcMar>
+          </w:tcPr>
+          <w:p>
+            <w:pPr>
+              <w:keepLines/>
+              <w:spacing w:before="0" w:after="0" w:line="240" w:lineRule="auto"/>
+              <w:jc w:val="right"/>
+            </w:pPr>
+            <w:r>
+              <w:rPr>
+                <w:rFonts w:ascii="Times New Roman" w:hAnsi="Times New Roman"/>
+                <w:b w:val="0"/>
+                <w:sz w:val="22"/>
+              </w:rPr>
+              <w:t>6</w:t>
+            </w:r>
+          </w:p>
+        </w:tc>
+      </w:tr>
+      <w:tr>
+        <w:trPr>
+          <w:cantSplit/>
+        </w:trPr>
+        <w:tc>
+          <w:tcPr>
+            <w:tcW w:type="dxa" w:w="8712"/>
+            <w:vAlign w:val="center"/>
+            <w:tcMar>
+              <w:top w:w="35" w:type="dxa"/>
+              <w:bottom w:w="35" w:type="dxa"/>
+              <w:left w:w="35" w:type="dxa"/>
+              <w:right w:w="35" w:type="dxa"/>
+            </w:tcMar>
+          </w:tcPr>
+          <w:p>
+            <w:pPr>
+              <w:keepLines/>
+              <w:spacing w:before="0" w:after="0" w:line="240" w:lineRule="auto"/>
+              <w:ind w:left="280"/>
+              <w:jc w:val="left"/>
+            </w:pPr>
+            <w:r>
+              <w:rPr>
+                <w:rFonts w:ascii="Times New Roman" w:hAnsi="Times New Roman"/>
+                <w:b w:val="0"/>
+                <w:sz w:val="22"/>
+              </w:rPr>
+              <w:t>2.3. Các thách thức chính</w:t>
+            </w:r>
+          </w:p>
+        </w:tc>
+        <w:tc>
+          <w:tcPr>
+            <w:tcW w:type="dxa" w:w="648"/>
+            <w:vAlign w:val="center"/>
+            <w:tcMar>
+              <w:top w:w="35" w:type="dxa"/>
+              <w:bottom w:w="35" w:type="dxa"/>
+              <w:left w:w="35" w:type="dxa"/>
+              <w:right w:w="35" w:type="dxa"/>
+            </w:tcMar>
+          </w:tcPr>
+          <w:p>
+            <w:pPr>
+              <w:keepLines/>
+              <w:spacing w:before="0" w:after="0" w:line="240" w:lineRule="auto"/>
+              <w:jc w:val="right"/>
+            </w:pPr>
+            <w:r>
+              <w:rPr>
+                <w:rFonts w:ascii="Times New Roman" w:hAnsi="Times New Roman"/>
+                <w:b w:val="0"/>
+                <w:sz w:val="22"/>
+              </w:rPr>
+              <w:t>7</w:t>
+            </w:r>
+          </w:p>
+        </w:tc>
+      </w:tr>
+      <w:tr>
+        <w:trPr>
+          <w:cantSplit/>
+        </w:trPr>
+        <w:tc>
+          <w:tcPr>
+            <w:tcW w:type="dxa" w:w="8712"/>
+            <w:vAlign w:val="center"/>
+            <w:tcMar>
+              <w:top w:w="35" w:type="dxa"/>
+              <w:bottom w:w="35" w:type="dxa"/>
+              <w:left w:w="35" w:type="dxa"/>
+              <w:right w:w="35" w:type="dxa"/>
+            </w:tcMar>
+          </w:tcPr>
+          <w:p>
+            <w:pPr>
+              <w:keepLines/>
+              <w:spacing w:before="0" w:after="0" w:line="240" w:lineRule="auto"/>
+              <w:ind w:left="280"/>
+              <w:jc w:val="left"/>
+            </w:pPr>
+            <w:r>
+              <w:rPr>
+                <w:rFonts w:ascii="Times New Roman" w:hAnsi="Times New Roman"/>
+                <w:b w:val="0"/>
+                <w:sz w:val="22"/>
+              </w:rPr>
+              <w:t>2.4. Yêu cầu kỹ thuật</w:t>
+            </w:r>
+          </w:p>
+        </w:tc>
+        <w:tc>
+          <w:tcPr>
+            <w:tcW w:type="dxa" w:w="648"/>
+            <w:vAlign w:val="center"/>
+            <w:tcMar>
+              <w:top w:w="35" w:type="dxa"/>
+              <w:bottom w:w="35" w:type="dxa"/>
+              <w:left w:w="35" w:type="dxa"/>
+              <w:right w:w="35" w:type="dxa"/>
+            </w:tcMar>
+          </w:tcPr>
+          <w:p>
+            <w:pPr>
+              <w:keepLines/>
+              <w:spacing w:before="0" w:after="0" w:line="240" w:lineRule="auto"/>
+              <w:jc w:val="right"/>
+            </w:pPr>
+            <w:r>
+              <w:rPr>
+                <w:rFonts w:ascii="Times New Roman" w:hAnsi="Times New Roman"/>
+                <w:b w:val="0"/>
+                <w:sz w:val="22"/>
+              </w:rPr>
+              <w:t>7</w:t>
+            </w:r>
+          </w:p>
+        </w:tc>
+      </w:tr>
+      <w:tr>
+        <w:trPr>
+          <w:cantSplit/>
+        </w:trPr>
+        <w:tc>
+          <w:tcPr>
+            <w:tcW w:type="dxa" w:w="8712"/>
+            <w:vAlign w:val="center"/>
+            <w:tcMar>
+              <w:top w:w="35" w:type="dxa"/>
+              <w:bottom w:w="35" w:type="dxa"/>
+              <w:left w:w="35" w:type="dxa"/>
+              <w:right w:w="35" w:type="dxa"/>
+            </w:tcMar>
+          </w:tcPr>
+          <w:p>
+            <w:pPr>
+              <w:keepLines/>
+              <w:spacing w:before="0" w:after="0" w:line="240" w:lineRule="auto"/>
+              <w:ind w:left="280"/>
+              <w:jc w:val="left"/>
+            </w:pPr>
+            <w:r>
+              <w:rPr>
+                <w:rFonts w:ascii="Times New Roman" w:hAnsi="Times New Roman"/>
+                <w:b w:val="0"/>
+                <w:sz w:val="22"/>
+              </w:rPr>
+              <w:t>2.5. Câu hỏi nghiên cứu</w:t>
+            </w:r>
+          </w:p>
+        </w:tc>
+        <w:tc>
+          <w:tcPr>
+            <w:tcW w:type="dxa" w:w="648"/>
+            <w:vAlign w:val="center"/>
+            <w:tcMar>
+              <w:top w:w="35" w:type="dxa"/>
+              <w:bottom w:w="35" w:type="dxa"/>
+              <w:left w:w="35" w:type="dxa"/>
+              <w:right w:w="35" w:type="dxa"/>
+            </w:tcMar>
+          </w:tcPr>
+          <w:p>
+            <w:pPr>
+              <w:keepLines/>
+              <w:spacing w:before="0" w:after="0" w:line="240" w:lineRule="auto"/>
+              <w:jc w:val="right"/>
+            </w:pPr>
+            <w:r>
+              <w:rPr>
+                <w:rFonts w:ascii="Times New Roman" w:hAnsi="Times New Roman"/>
+                <w:b w:val="0"/>
+                <w:sz w:val="22"/>
+              </w:rPr>
+              <w:t>8</w:t>
+            </w:r>
+          </w:p>
+        </w:tc>
+      </w:tr>
+      <w:tr>
+        <w:trPr>
+          <w:cantSplit/>
+        </w:trPr>
+        <w:tc>
+          <w:tcPr>
+            <w:tcW w:type="dxa" w:w="8712"/>
+            <w:vAlign w:val="center"/>
+            <w:tcMar>
+              <w:top w:w="35" w:type="dxa"/>
+              <w:bottom w:w="35" w:type="dxa"/>
+              <w:left w:w="35" w:type="dxa"/>
+              <w:right w:w="35" w:type="dxa"/>
+            </w:tcMar>
+          </w:tcPr>
+          <w:p>
+            <w:pPr>
+              <w:keepLines/>
+              <w:spacing w:before="60" w:after="0" w:line="240" w:lineRule="auto"/>
+              <w:ind w:left="0"/>
+              <w:jc w:val="left"/>
+            </w:pPr>
+            <w:r>
+              <w:rPr>
+                <w:rFonts w:ascii="Times New Roman" w:hAnsi="Times New Roman"/>
+                <w:b/>
+                <w:color w:val="365F91"/>
+                <w:sz w:val="22"/>
+              </w:rPr>
+              <w:t>CHƯƠNG 3. MÔ TẢ DỮ LIỆU</w:t>
+            </w:r>
+          </w:p>
+        </w:tc>
+        <w:tc>
+          <w:tcPr>
+            <w:tcW w:type="dxa" w:w="648"/>
+            <w:vAlign w:val="center"/>
+            <w:tcMar>
+              <w:top w:w="35" w:type="dxa"/>
+              <w:bottom w:w="35" w:type="dxa"/>
+              <w:left w:w="35" w:type="dxa"/>
+              <w:right w:w="35" w:type="dxa"/>
+            </w:tcMar>
+          </w:tcPr>
+          <w:p>
+            <w:pPr>
+              <w:keepLines/>
+              <w:spacing w:before="60" w:after="0" w:line="240" w:lineRule="auto"/>
+              <w:jc w:val="right"/>
+            </w:pPr>
+            <w:r>
+              <w:rPr>
+                <w:rFonts w:ascii="Times New Roman" w:hAnsi="Times New Roman"/>
+                <w:b/>
+                <w:color w:val="365F91"/>
+                <w:sz w:val="22"/>
+              </w:rPr>
+              <w:t>9</w:t>
+            </w:r>
+          </w:p>
+        </w:tc>
+      </w:tr>
+      <w:tr>
+        <w:trPr>
+          <w:cantSplit/>
+        </w:trPr>
+        <w:tc>
+          <w:tcPr>
+            <w:tcW w:type="dxa" w:w="8712"/>
+            <w:vAlign w:val="center"/>
+            <w:tcMar>
+              <w:top w:w="35" w:type="dxa"/>
+              <w:bottom w:w="35" w:type="dxa"/>
+              <w:left w:w="35" w:type="dxa"/>
+              <w:right w:w="35" w:type="dxa"/>
+            </w:tcMar>
+          </w:tcPr>
+          <w:p>
+            <w:pPr>
+              <w:keepLines/>
+              <w:spacing w:before="0" w:after="0" w:line="240" w:lineRule="auto"/>
+              <w:ind w:left="280"/>
+              <w:jc w:val="left"/>
+            </w:pPr>
+            <w:r>
+              <w:rPr>
+                <w:rFonts w:ascii="Times New Roman" w:hAnsi="Times New Roman"/>
+                <w:b w:val="0"/>
+                <w:sz w:val="22"/>
+              </w:rPr>
+              <w:t>3.1. Nguồn dữ liệu</w:t>
+            </w:r>
+          </w:p>
+        </w:tc>
+        <w:tc>
+          <w:tcPr>
+            <w:tcW w:type="dxa" w:w="648"/>
+            <w:vAlign w:val="center"/>
+            <w:tcMar>
+              <w:top w:w="35" w:type="dxa"/>
+              <w:bottom w:w="35" w:type="dxa"/>
+              <w:left w:w="35" w:type="dxa"/>
+              <w:right w:w="35" w:type="dxa"/>
+            </w:tcMar>
+          </w:tcPr>
+          <w:p>
+            <w:pPr>
+              <w:keepLines/>
+              <w:spacing w:before="0" w:after="0" w:line="240" w:lineRule="auto"/>
+              <w:jc w:val="right"/>
+            </w:pPr>
+            <w:r>
+              <w:rPr>
+                <w:rFonts w:ascii="Times New Roman" w:hAnsi="Times New Roman"/>
+                <w:b w:val="0"/>
+                <w:sz w:val="22"/>
+              </w:rPr>
+              <w:t>9</w:t>
+            </w:r>
+          </w:p>
+        </w:tc>
+      </w:tr>
+      <w:tr>
+        <w:trPr>
+          <w:cantSplit/>
+        </w:trPr>
+        <w:tc>
+          <w:tcPr>
+            <w:tcW w:type="dxa" w:w="8712"/>
+            <w:vAlign w:val="center"/>
+            <w:tcMar>
+              <w:top w:w="35" w:type="dxa"/>
+              <w:bottom w:w="35" w:type="dxa"/>
+              <w:left w:w="35" w:type="dxa"/>
+              <w:right w:w="35" w:type="dxa"/>
+            </w:tcMar>
+          </w:tcPr>
+          <w:p>
+            <w:pPr>
+              <w:keepLines/>
+              <w:spacing w:before="0" w:after="0" w:line="240" w:lineRule="auto"/>
+              <w:ind w:left="280"/>
+              <w:jc w:val="left"/>
+            </w:pPr>
+            <w:r>
+              <w:rPr>
+                <w:rFonts w:ascii="Times New Roman" w:hAnsi="Times New Roman"/>
+                <w:b w:val="0"/>
+                <w:sz w:val="22"/>
+              </w:rPr>
+              <w:t>3.2. Cấu trúc dữ liệu gốc</w:t>
+            </w:r>
+          </w:p>
+        </w:tc>
+        <w:tc>
+          <w:tcPr>
+            <w:tcW w:type="dxa" w:w="648"/>
+            <w:vAlign w:val="center"/>
+            <w:tcMar>
+              <w:top w:w="35" w:type="dxa"/>
+              <w:bottom w:w="35" w:type="dxa"/>
+              <w:left w:w="35" w:type="dxa"/>
+              <w:right w:w="35" w:type="dxa"/>
+            </w:tcMar>
+          </w:tcPr>
+          <w:p>
+            <w:pPr>
+              <w:keepLines/>
+              <w:spacing w:before="0" w:after="0" w:line="240" w:lineRule="auto"/>
+              <w:jc w:val="right"/>
+            </w:pPr>
+            <w:r>
+              <w:rPr>
+                <w:rFonts w:ascii="Times New Roman" w:hAnsi="Times New Roman"/>
+                <w:b w:val="0"/>
+                <w:sz w:val="22"/>
+              </w:rPr>
+              <w:t>9</w:t>
+            </w:r>
+          </w:p>
+        </w:tc>
+      </w:tr>
+      <w:tr>
+        <w:trPr>
+          <w:cantSplit/>
+        </w:trPr>
+        <w:tc>
+          <w:tcPr>
+            <w:tcW w:type="dxa" w:w="8712"/>
+            <w:vAlign w:val="center"/>
+            <w:tcMar>
+              <w:top w:w="35" w:type="dxa"/>
+              <w:bottom w:w="35" w:type="dxa"/>
+              <w:left w:w="35" w:type="dxa"/>
+              <w:right w:w="35" w:type="dxa"/>
+            </w:tcMar>
+          </w:tcPr>
+          <w:p>
+            <w:pPr>
+              <w:keepLines/>
+              <w:spacing w:before="0" w:after="0" w:line="240" w:lineRule="auto"/>
+              <w:ind w:left="280"/>
+              <w:jc w:val="left"/>
+            </w:pPr>
+            <w:r>
+              <w:rPr>
+                <w:rFonts w:ascii="Times New Roman" w:hAnsi="Times New Roman"/>
+                <w:b w:val="0"/>
+                <w:sz w:val="22"/>
+              </w:rPr>
+              <w:t>3.3. Phân bố giao dịch và nhãn</w:t>
+            </w:r>
+          </w:p>
+        </w:tc>
+        <w:tc>
+          <w:tcPr>
+            <w:tcW w:type="dxa" w:w="648"/>
+            <w:vAlign w:val="center"/>
+            <w:tcMar>
+              <w:top w:w="35" w:type="dxa"/>
+              <w:bottom w:w="35" w:type="dxa"/>
+              <w:left w:w="35" w:type="dxa"/>
+              <w:right w:w="35" w:type="dxa"/>
+            </w:tcMar>
+          </w:tcPr>
+          <w:p>
+            <w:pPr>
+              <w:keepLines/>
+              <w:spacing w:before="0" w:after="0" w:line="240" w:lineRule="auto"/>
+              <w:jc w:val="right"/>
+            </w:pPr>
+            <w:r>
+              <w:rPr>
+                <w:rFonts w:ascii="Times New Roman" w:hAnsi="Times New Roman"/>
+                <w:b w:val="0"/>
+                <w:sz w:val="22"/>
+              </w:rPr>
+              <w:t>10</w:t>
+            </w:r>
+          </w:p>
+        </w:tc>
+      </w:tr>
+      <w:tr>
+        <w:trPr>
+          <w:cantSplit/>
+        </w:trPr>
+        <w:tc>
+          <w:tcPr>
+            <w:tcW w:type="dxa" w:w="8712"/>
+            <w:vAlign w:val="center"/>
+            <w:tcMar>
+              <w:top w:w="35" w:type="dxa"/>
+              <w:bottom w:w="35" w:type="dxa"/>
+              <w:left w:w="35" w:type="dxa"/>
+              <w:right w:w="35" w:type="dxa"/>
+            </w:tcMar>
+          </w:tcPr>
+          <w:p>
+            <w:pPr>
+              <w:keepLines/>
+              <w:spacing w:before="0" w:after="0" w:line="240" w:lineRule="auto"/>
+              <w:ind w:left="280"/>
+              <w:jc w:val="left"/>
+            </w:pPr>
+            <w:r>
+              <w:rPr>
+                <w:rFonts w:ascii="Times New Roman" w:hAnsi="Times New Roman"/>
+                <w:b w:val="0"/>
+                <w:sz w:val="22"/>
+              </w:rPr>
+              <w:t>3.4. Downsampling và chia tập</w:t>
+            </w:r>
+          </w:p>
+        </w:tc>
+        <w:tc>
+          <w:tcPr>
+            <w:tcW w:type="dxa" w:w="648"/>
+            <w:vAlign w:val="center"/>
+            <w:tcMar>
+              <w:top w:w="35" w:type="dxa"/>
+              <w:bottom w:w="35" w:type="dxa"/>
+              <w:left w:w="35" w:type="dxa"/>
+              <w:right w:w="35" w:type="dxa"/>
+            </w:tcMar>
+          </w:tcPr>
+          <w:p>
+            <w:pPr>
+              <w:keepLines/>
+              <w:spacing w:before="0" w:after="0" w:line="240" w:lineRule="auto"/>
+              <w:jc w:val="right"/>
+            </w:pPr>
+            <w:r>
+              <w:rPr>
+                <w:rFonts w:ascii="Times New Roman" w:hAnsi="Times New Roman"/>
+                <w:b w:val="0"/>
+                <w:sz w:val="22"/>
+              </w:rPr>
+              <w:t>10</w:t>
+            </w:r>
+          </w:p>
+        </w:tc>
+      </w:tr>
+      <w:tr>
+        <w:trPr>
+          <w:cantSplit/>
+        </w:trPr>
+        <w:tc>
+          <w:tcPr>
+            <w:tcW w:type="dxa" w:w="8712"/>
+            <w:vAlign w:val="center"/>
+            <w:tcMar>
+              <w:top w:w="35" w:type="dxa"/>
+              <w:bottom w:w="35" w:type="dxa"/>
+              <w:left w:w="35" w:type="dxa"/>
+              <w:right w:w="35" w:type="dxa"/>
+            </w:tcMar>
+          </w:tcPr>
+          <w:p>
+            <w:pPr>
+              <w:keepLines/>
+              <w:spacing w:before="0" w:after="0" w:line="240" w:lineRule="auto"/>
+              <w:ind w:left="280"/>
+              <w:jc w:val="left"/>
+            </w:pPr>
+            <w:r>
+              <w:rPr>
+                <w:rFonts w:ascii="Times New Roman" w:hAnsi="Times New Roman"/>
+                <w:b w:val="0"/>
+                <w:sz w:val="22"/>
+              </w:rPr>
+              <w:t>3.5. Các đặc trưng sau Phase 01</w:t>
+            </w:r>
+          </w:p>
+        </w:tc>
+        <w:tc>
+          <w:tcPr>
+            <w:tcW w:type="dxa" w:w="648"/>
+            <w:vAlign w:val="center"/>
+            <w:tcMar>
+              <w:top w:w="35" w:type="dxa"/>
+              <w:bottom w:w="35" w:type="dxa"/>
+              <w:left w:w="35" w:type="dxa"/>
+              <w:right w:w="35" w:type="dxa"/>
+            </w:tcMar>
+          </w:tcPr>
+          <w:p>
+            <w:pPr>
+              <w:keepLines/>
+              <w:spacing w:before="0" w:after="0" w:line="240" w:lineRule="auto"/>
+              <w:jc w:val="right"/>
+            </w:pPr>
+            <w:r>
+              <w:rPr>
+                <w:rFonts w:ascii="Times New Roman" w:hAnsi="Times New Roman"/>
+                <w:b w:val="0"/>
+                <w:sz w:val="22"/>
+              </w:rPr>
+              <w:t>10</w:t>
+            </w:r>
+          </w:p>
+        </w:tc>
+      </w:tr>
+      <w:tr>
+        <w:trPr>
+          <w:cantSplit/>
+        </w:trPr>
+        <w:tc>
+          <w:tcPr>
+            <w:tcW w:type="dxa" w:w="8712"/>
+            <w:vAlign w:val="center"/>
+            <w:tcMar>
+              <w:top w:w="35" w:type="dxa"/>
+              <w:bottom w:w="35" w:type="dxa"/>
+              <w:left w:w="35" w:type="dxa"/>
+              <w:right w:w="35" w:type="dxa"/>
+            </w:tcMar>
+          </w:tcPr>
+          <w:p>
+            <w:pPr>
+              <w:keepLines/>
+              <w:spacing w:before="0" w:after="0" w:line="240" w:lineRule="auto"/>
+              <w:ind w:left="280"/>
+              <w:jc w:val="left"/>
+            </w:pPr>
+            <w:r>
+              <w:rPr>
+                <w:rFonts w:ascii="Times New Roman" w:hAnsi="Times New Roman"/>
+                <w:b w:val="0"/>
+                <w:sz w:val="22"/>
+              </w:rPr>
+              <w:t>3.6. Hạn chế và nguy cơ ảnh hưởng tính hợp lệ</w:t>
+            </w:r>
+          </w:p>
+        </w:tc>
+        <w:tc>
+          <w:tcPr>
+            <w:tcW w:type="dxa" w:w="648"/>
+            <w:vAlign w:val="center"/>
+            <w:tcMar>
+              <w:top w:w="35" w:type="dxa"/>
+              <w:bottom w:w="35" w:type="dxa"/>
+              <w:left w:w="35" w:type="dxa"/>
+              <w:right w:w="35" w:type="dxa"/>
+            </w:tcMar>
+          </w:tcPr>
+          <w:p>
+            <w:pPr>
+              <w:keepLines/>
+              <w:spacing w:before="0" w:after="0" w:line="240" w:lineRule="auto"/>
+              <w:jc w:val="right"/>
+            </w:pPr>
+            <w:r>
+              <w:rPr>
+                <w:rFonts w:ascii="Times New Roman" w:hAnsi="Times New Roman"/>
+                <w:b w:val="0"/>
+                <w:sz w:val="22"/>
+              </w:rPr>
+              <w:t>11</w:t>
+            </w:r>
+          </w:p>
+        </w:tc>
+      </w:tr>
+      <w:tr>
+        <w:trPr>
+          <w:cantSplit/>
+        </w:trPr>
+        <w:tc>
+          <w:tcPr>
+            <w:tcW w:type="dxa" w:w="8712"/>
+            <w:vAlign w:val="center"/>
+            <w:tcMar>
+              <w:top w:w="35" w:type="dxa"/>
+              <w:bottom w:w="35" w:type="dxa"/>
+              <w:left w:w="35" w:type="dxa"/>
+              <w:right w:w="35" w:type="dxa"/>
+            </w:tcMar>
+          </w:tcPr>
+          <w:p>
+            <w:pPr>
+              <w:keepLines/>
+              <w:spacing w:before="0" w:after="0" w:line="240" w:lineRule="auto"/>
+              <w:ind w:left="280"/>
+              <w:jc w:val="left"/>
+            </w:pPr>
+            <w:r>
+              <w:rPr>
+                <w:rFonts w:ascii="Times New Roman" w:hAnsi="Times New Roman"/>
+                <w:b w:val="0"/>
+                <w:sz w:val="22"/>
+              </w:rPr>
+              <w:t>3.7. Kết luận chương</w:t>
+            </w:r>
+          </w:p>
+        </w:tc>
+        <w:tc>
+          <w:tcPr>
+            <w:tcW w:type="dxa" w:w="648"/>
+            <w:vAlign w:val="center"/>
+            <w:tcMar>
+              <w:top w:w="35" w:type="dxa"/>
+              <w:bottom w:w="35" w:type="dxa"/>
+              <w:left w:w="35" w:type="dxa"/>
+              <w:right w:w="35" w:type="dxa"/>
+            </w:tcMar>
+          </w:tcPr>
+          <w:p>
+            <w:pPr>
+              <w:keepLines/>
+              <w:spacing w:before="0" w:after="0" w:line="240" w:lineRule="auto"/>
+              <w:jc w:val="right"/>
+            </w:pPr>
+            <w:r>
+              <w:rPr>
+                <w:rFonts w:ascii="Times New Roman" w:hAnsi="Times New Roman"/>
+                <w:b w:val="0"/>
+                <w:sz w:val="22"/>
+              </w:rPr>
+              <w:t>12</w:t>
+            </w:r>
+          </w:p>
+        </w:tc>
+      </w:tr>
+      <w:tr>
+        <w:trPr>
+          <w:cantSplit/>
+        </w:trPr>
+        <w:tc>
+          <w:tcPr>
+            <w:tcW w:type="dxa" w:w="8712"/>
+            <w:vAlign w:val="center"/>
+            <w:tcMar>
+              <w:top w:w="35" w:type="dxa"/>
+              <w:bottom w:w="35" w:type="dxa"/>
+              <w:left w:w="35" w:type="dxa"/>
+              <w:right w:w="35" w:type="dxa"/>
+            </w:tcMar>
+          </w:tcPr>
+          <w:p>
+            <w:pPr>
+              <w:keepLines/>
+              <w:spacing w:before="60" w:after="0" w:line="240" w:lineRule="auto"/>
+              <w:ind w:left="0"/>
+              <w:jc w:val="left"/>
+            </w:pPr>
+            <w:r>
+              <w:rPr>
+                <w:rFonts w:ascii="Times New Roman" w:hAnsi="Times New Roman"/>
+                <w:b/>
+                <w:color w:val="365F91"/>
+                <w:sz w:val="22"/>
+              </w:rPr>
+              <w:t>TÀI LIỆU THAM KHẢO TẠM THỜI</w:t>
+            </w:r>
+          </w:p>
+        </w:tc>
+        <w:tc>
+          <w:tcPr>
+            <w:tcW w:type="dxa" w:w="648"/>
+            <w:vAlign w:val="center"/>
+            <w:tcMar>
+              <w:top w:w="35" w:type="dxa"/>
+              <w:bottom w:w="35" w:type="dxa"/>
+              <w:left w:w="35" w:type="dxa"/>
+              <w:right w:w="35" w:type="dxa"/>
+            </w:tcMar>
+          </w:tcPr>
+          <w:p>
+            <w:pPr>
+              <w:keepLines/>
+              <w:spacing w:before="60" w:after="0" w:line="240" w:lineRule="auto"/>
+              <w:jc w:val="right"/>
+            </w:pPr>
+            <w:r>
+              <w:rPr>
+                <w:rFonts w:ascii="Times New Roman" w:hAnsi="Times New Roman"/>
+                <w:b/>
+                <w:color w:val="365F91"/>
+                <w:sz w:val="22"/>
+              </w:rPr>
+              <w:t>13</w:t>
+            </w:r>
+          </w:p>
+        </w:tc>
+      </w:tr>
+    </w:tbl>
     <w:p>
       <w:pPr>
         <w:ind w:firstLine="567"/>
@@ -4260,23 +5511,40 @@
         <w:pStyle w:val="Heading2"/>
       </w:pPr>
       <w:r>
-        <w:rPr>
-          <w:rFonts w:ascii="Times New Roman" w:hAnsi="Times New Roman" w:eastAsia="Times New Roman"/>
-        </w:rPr>
-        <w:t>Sources</w:t>
+        <w:t>Tài liệu bên ngoài</w:t>
       </w:r>
     </w:p>
     <w:p>
       <w:pPr>
         <w:pStyle w:val="ReportBody"/>
-        <w:ind w:firstLine="567"/>
-        <w:jc w:val="both"/>
+        <w:spacing w:after="100" w:line="276" w:lineRule="auto"/>
+        <w:ind w:left="432" w:hanging="432"/>
+        <w:jc w:val="left"/>
       </w:pPr>
       <w:r>
-        <w:rPr>
-          <w:rFonts w:ascii="Times New Roman" w:hAnsi="Times New Roman" w:eastAsia="Times New Roman"/>
-        </w:rPr>
-        <w:t>[1] https://doi.org/10.1016/j.jnca.2016.04.007 — Fraud detection system: A survey [2] https://www.msc-les.org/proceedings/emss/2016/EMSS2016_249.pdf — PaySim: A Financial Mobile Money Simulator for Fraud Detection [3] https://www.kaggle.com/datasets/ealaxi/paysim1 — Synthetic Financial Datasets for Fraud Detection</w:t>
+        <w:t>[1] https://doi.org/10.1016/j.jnca.2016.04.007 — Fraud detection system: A survey.</w:t>
+      </w:r>
+    </w:p>
+    <w:p>
+      <w:pPr>
+        <w:pStyle w:val="ReportBody"/>
+        <w:spacing w:after="100" w:line="276" w:lineRule="auto"/>
+        <w:ind w:left="432" w:hanging="432"/>
+        <w:jc w:val="left"/>
+      </w:pPr>
+      <w:r>
+        <w:t>[2] https://www.msc-les.org/proceedings/emss/2016/EMSS2016_249.pdf — PaySim: A Financial Mobile Money Simulator for Fraud Detection.</w:t>
+      </w:r>
+    </w:p>
+    <w:p>
+      <w:pPr>
+        <w:pStyle w:val="ReportBody"/>
+        <w:spacing w:after="100" w:line="276" w:lineRule="auto"/>
+        <w:ind w:left="432" w:hanging="432"/>
+        <w:jc w:val="left"/>
+      </w:pPr>
+      <w:r>
+        <w:t>[3] https://www.kaggle.com/datasets/ealaxi/paysim1 — Synthetic Financial Datasets for Fraud Detection.</w:t>
       </w:r>
     </w:p>
     <w:sectPr>

</xml_diff>

<commit_message>
docs(phase07): polish Sprint 2 report layout and add exported PDF
</commit_message>
<xml_diff>
--- a/draft/fraud-detection/reports/[Nhom9]_BaoCao_FraudDetection_Sprint2_Duy.docx
+++ b/draft/fraud-detection/reports/[Nhom9]_BaoCao_FraudDetection_Sprint2_Duy.docx
@@ -686,42 +686,1293 @@
         <w:t>MỤC LỤC</w:t>
       </w:r>
     </w:p>
-    <w:p>
-      <w:pPr>
-        <w:ind w:firstLine="567"/>
-        <w:jc w:val="both"/>
-      </w:pPr>
-      <w:r>
-        <w:rPr>
-          <w:rFonts w:ascii="Times New Roman" w:hAnsi="Times New Roman" w:eastAsia="Times New Roman"/>
-        </w:rPr>
-        <w:fldChar w:fldCharType="begin"/>
-      </w:r>
-      <w:r>
-        <w:rPr>
-          <w:rFonts w:ascii="Times New Roman" w:hAnsi="Times New Roman" w:eastAsia="Times New Roman"/>
-        </w:rPr>
-        <w:instrText xml:space="preserve"> TOC \o "1-3" \h \z \u </w:instrText>
-      </w:r>
-      <w:r>
-        <w:rPr>
-          <w:rFonts w:ascii="Times New Roman" w:hAnsi="Times New Roman" w:eastAsia="Times New Roman"/>
-        </w:rPr>
-        <w:fldChar w:fldCharType="separate"/>
-      </w:r>
-      <w:r>
-        <w:rPr>
-          <w:rFonts w:ascii="Times New Roman" w:hAnsi="Times New Roman" w:eastAsia="Times New Roman"/>
-        </w:rPr>
-        <w:t>Mục lục sẽ được cập nhật khi mở file trong Word (References → Update Table).</w:t>
-      </w:r>
-      <w:r>
-        <w:rPr>
-          <w:rFonts w:ascii="Times New Roman" w:hAnsi="Times New Roman" w:eastAsia="Times New Roman"/>
-        </w:rPr>
-        <w:fldChar w:fldCharType="end"/>
-      </w:r>
-    </w:p>
+    <w:tbl>
+      <w:tblPr>
+        <w:tblW w:type="auto" w:w="0"/>
+        <w:tblLayout w:type="fixed"/>
+        <w:tblLook w:firstColumn="1" w:firstRow="1" w:lastColumn="0" w:lastRow="0" w:noHBand="0" w:noVBand="1" w:val="04A0"/>
+        <w:tblBorders>
+          <w:top w:val="nil"/>
+          <w:left w:val="nil"/>
+          <w:bottom w:val="nil"/>
+          <w:right w:val="nil"/>
+          <w:insideH w:val="nil"/>
+          <w:insideV w:val="nil"/>
+        </w:tblBorders>
+      </w:tblPr>
+      <w:tblGrid>
+        <w:gridCol w:w="8712"/>
+        <w:gridCol w:w="648"/>
+      </w:tblGrid>
+      <w:tr>
+        <w:trPr>
+          <w:cantSplit/>
+        </w:trPr>
+        <w:tc>
+          <w:tcPr>
+            <w:tcW w:type="dxa" w:w="8712"/>
+            <w:vAlign w:val="center"/>
+            <w:tcMar>
+              <w:top w:w="35" w:type="dxa"/>
+              <w:bottom w:w="35" w:type="dxa"/>
+              <w:left w:w="35" w:type="dxa"/>
+              <w:right w:w="35" w:type="dxa"/>
+            </w:tcMar>
+          </w:tcPr>
+          <w:p>
+            <w:pPr>
+              <w:keepLines/>
+              <w:spacing w:before="60" w:after="0" w:line="240" w:lineRule="auto"/>
+              <w:ind w:left="0"/>
+              <w:jc w:val="left"/>
+            </w:pPr>
+            <w:r>
+              <w:rPr>
+                <w:rFonts w:ascii="Times New Roman" w:hAnsi="Times New Roman"/>
+                <w:b/>
+                <w:color w:val="365F91"/>
+                <w:sz w:val="22"/>
+              </w:rPr>
+              <w:t>CHƯƠNG 1. GIỚI THIỆU</w:t>
+            </w:r>
+          </w:p>
+        </w:tc>
+        <w:tc>
+          <w:tcPr>
+            <w:tcW w:type="dxa" w:w="648"/>
+            <w:vAlign w:val="center"/>
+            <w:tcMar>
+              <w:top w:w="35" w:type="dxa"/>
+              <w:bottom w:w="35" w:type="dxa"/>
+              <w:left w:w="35" w:type="dxa"/>
+              <w:right w:w="35" w:type="dxa"/>
+            </w:tcMar>
+          </w:tcPr>
+          <w:p>
+            <w:pPr>
+              <w:keepLines/>
+              <w:spacing w:before="60" w:after="0" w:line="240" w:lineRule="auto"/>
+              <w:jc w:val="right"/>
+            </w:pPr>
+            <w:r>
+              <w:rPr>
+                <w:rFonts w:ascii="Times New Roman" w:hAnsi="Times New Roman"/>
+                <w:b/>
+                <w:color w:val="365F91"/>
+                <w:sz w:val="22"/>
+              </w:rPr>
+              <w:t>3</w:t>
+            </w:r>
+          </w:p>
+        </w:tc>
+      </w:tr>
+      <w:tr>
+        <w:trPr>
+          <w:cantSplit/>
+        </w:trPr>
+        <w:tc>
+          <w:tcPr>
+            <w:tcW w:type="dxa" w:w="8712"/>
+            <w:vAlign w:val="center"/>
+            <w:tcMar>
+              <w:top w:w="35" w:type="dxa"/>
+              <w:bottom w:w="35" w:type="dxa"/>
+              <w:left w:w="35" w:type="dxa"/>
+              <w:right w:w="35" w:type="dxa"/>
+            </w:tcMar>
+          </w:tcPr>
+          <w:p>
+            <w:pPr>
+              <w:keepLines/>
+              <w:spacing w:before="0" w:after="0" w:line="240" w:lineRule="auto"/>
+              <w:ind w:left="280"/>
+              <w:jc w:val="left"/>
+            </w:pPr>
+            <w:r>
+              <w:rPr>
+                <w:rFonts w:ascii="Times New Roman" w:hAnsi="Times New Roman"/>
+                <w:b w:val="0"/>
+                <w:sz w:val="22"/>
+              </w:rPr>
+              <w:t>1.1. Bối cảnh</w:t>
+            </w:r>
+          </w:p>
+        </w:tc>
+        <w:tc>
+          <w:tcPr>
+            <w:tcW w:type="dxa" w:w="648"/>
+            <w:vAlign w:val="center"/>
+            <w:tcMar>
+              <w:top w:w="35" w:type="dxa"/>
+              <w:bottom w:w="35" w:type="dxa"/>
+              <w:left w:w="35" w:type="dxa"/>
+              <w:right w:w="35" w:type="dxa"/>
+            </w:tcMar>
+          </w:tcPr>
+          <w:p>
+            <w:pPr>
+              <w:keepLines/>
+              <w:spacing w:before="0" w:after="0" w:line="240" w:lineRule="auto"/>
+              <w:jc w:val="right"/>
+            </w:pPr>
+            <w:r>
+              <w:rPr>
+                <w:rFonts w:ascii="Times New Roman" w:hAnsi="Times New Roman"/>
+                <w:b w:val="0"/>
+                <w:sz w:val="22"/>
+              </w:rPr>
+              <w:t>3</w:t>
+            </w:r>
+          </w:p>
+        </w:tc>
+      </w:tr>
+      <w:tr>
+        <w:trPr>
+          <w:cantSplit/>
+        </w:trPr>
+        <w:tc>
+          <w:tcPr>
+            <w:tcW w:type="dxa" w:w="8712"/>
+            <w:vAlign w:val="center"/>
+            <w:tcMar>
+              <w:top w:w="35" w:type="dxa"/>
+              <w:bottom w:w="35" w:type="dxa"/>
+              <w:left w:w="35" w:type="dxa"/>
+              <w:right w:w="35" w:type="dxa"/>
+            </w:tcMar>
+          </w:tcPr>
+          <w:p>
+            <w:pPr>
+              <w:keepLines/>
+              <w:spacing w:before="0" w:after="0" w:line="240" w:lineRule="auto"/>
+              <w:ind w:left="280"/>
+              <w:jc w:val="left"/>
+            </w:pPr>
+            <w:r>
+              <w:rPr>
+                <w:rFonts w:ascii="Times New Roman" w:hAnsi="Times New Roman"/>
+                <w:b w:val="0"/>
+                <w:sz w:val="22"/>
+              </w:rPr>
+              <w:t>1.2. Lý do chọn đề tài</w:t>
+            </w:r>
+          </w:p>
+        </w:tc>
+        <w:tc>
+          <w:tcPr>
+            <w:tcW w:type="dxa" w:w="648"/>
+            <w:vAlign w:val="center"/>
+            <w:tcMar>
+              <w:top w:w="35" w:type="dxa"/>
+              <w:bottom w:w="35" w:type="dxa"/>
+              <w:left w:w="35" w:type="dxa"/>
+              <w:right w:w="35" w:type="dxa"/>
+            </w:tcMar>
+          </w:tcPr>
+          <w:p>
+            <w:pPr>
+              <w:keepLines/>
+              <w:spacing w:before="0" w:after="0" w:line="240" w:lineRule="auto"/>
+              <w:jc w:val="right"/>
+            </w:pPr>
+            <w:r>
+              <w:rPr>
+                <w:rFonts w:ascii="Times New Roman" w:hAnsi="Times New Roman"/>
+                <w:b w:val="0"/>
+                <w:sz w:val="22"/>
+              </w:rPr>
+              <w:t>3</w:t>
+            </w:r>
+          </w:p>
+        </w:tc>
+      </w:tr>
+      <w:tr>
+        <w:trPr>
+          <w:cantSplit/>
+        </w:trPr>
+        <w:tc>
+          <w:tcPr>
+            <w:tcW w:type="dxa" w:w="8712"/>
+            <w:vAlign w:val="center"/>
+            <w:tcMar>
+              <w:top w:w="35" w:type="dxa"/>
+              <w:bottom w:w="35" w:type="dxa"/>
+              <w:left w:w="35" w:type="dxa"/>
+              <w:right w:w="35" w:type="dxa"/>
+            </w:tcMar>
+          </w:tcPr>
+          <w:p>
+            <w:pPr>
+              <w:keepLines/>
+              <w:spacing w:before="0" w:after="0" w:line="240" w:lineRule="auto"/>
+              <w:ind w:left="280"/>
+              <w:jc w:val="left"/>
+            </w:pPr>
+            <w:r>
+              <w:rPr>
+                <w:rFonts w:ascii="Times New Roman" w:hAnsi="Times New Roman"/>
+                <w:b w:val="0"/>
+                <w:sz w:val="22"/>
+              </w:rPr>
+              <w:t>1.3. Mục tiêu đề tài</w:t>
+            </w:r>
+          </w:p>
+        </w:tc>
+        <w:tc>
+          <w:tcPr>
+            <w:tcW w:type="dxa" w:w="648"/>
+            <w:vAlign w:val="center"/>
+            <w:tcMar>
+              <w:top w:w="35" w:type="dxa"/>
+              <w:bottom w:w="35" w:type="dxa"/>
+              <w:left w:w="35" w:type="dxa"/>
+              <w:right w:w="35" w:type="dxa"/>
+            </w:tcMar>
+          </w:tcPr>
+          <w:p>
+            <w:pPr>
+              <w:keepLines/>
+              <w:spacing w:before="0" w:after="0" w:line="240" w:lineRule="auto"/>
+              <w:jc w:val="right"/>
+            </w:pPr>
+            <w:r>
+              <w:rPr>
+                <w:rFonts w:ascii="Times New Roman" w:hAnsi="Times New Roman"/>
+                <w:b w:val="0"/>
+                <w:sz w:val="22"/>
+              </w:rPr>
+              <w:t>4</w:t>
+            </w:r>
+          </w:p>
+        </w:tc>
+      </w:tr>
+      <w:tr>
+        <w:trPr>
+          <w:cantSplit/>
+        </w:trPr>
+        <w:tc>
+          <w:tcPr>
+            <w:tcW w:type="dxa" w:w="8712"/>
+            <w:vAlign w:val="center"/>
+            <w:tcMar>
+              <w:top w:w="35" w:type="dxa"/>
+              <w:bottom w:w="35" w:type="dxa"/>
+              <w:left w:w="35" w:type="dxa"/>
+              <w:right w:w="35" w:type="dxa"/>
+            </w:tcMar>
+          </w:tcPr>
+          <w:p>
+            <w:pPr>
+              <w:keepLines/>
+              <w:spacing w:before="0" w:after="0" w:line="240" w:lineRule="auto"/>
+              <w:ind w:left="280"/>
+              <w:jc w:val="left"/>
+            </w:pPr>
+            <w:r>
+              <w:rPr>
+                <w:rFonts w:ascii="Times New Roman" w:hAnsi="Times New Roman"/>
+                <w:b w:val="0"/>
+                <w:sz w:val="22"/>
+              </w:rPr>
+              <w:t>1.4. Đối tượng và phạm vi nghiên cứu</w:t>
+            </w:r>
+          </w:p>
+        </w:tc>
+        <w:tc>
+          <w:tcPr>
+            <w:tcW w:type="dxa" w:w="648"/>
+            <w:vAlign w:val="center"/>
+            <w:tcMar>
+              <w:top w:w="35" w:type="dxa"/>
+              <w:bottom w:w="35" w:type="dxa"/>
+              <w:left w:w="35" w:type="dxa"/>
+              <w:right w:w="35" w:type="dxa"/>
+            </w:tcMar>
+          </w:tcPr>
+          <w:p>
+            <w:pPr>
+              <w:keepLines/>
+              <w:spacing w:before="0" w:after="0" w:line="240" w:lineRule="auto"/>
+              <w:jc w:val="right"/>
+            </w:pPr>
+            <w:r>
+              <w:rPr>
+                <w:rFonts w:ascii="Times New Roman" w:hAnsi="Times New Roman"/>
+                <w:b w:val="0"/>
+                <w:sz w:val="22"/>
+              </w:rPr>
+              <w:t>4</w:t>
+            </w:r>
+          </w:p>
+        </w:tc>
+      </w:tr>
+      <w:tr>
+        <w:trPr>
+          <w:cantSplit/>
+        </w:trPr>
+        <w:tc>
+          <w:tcPr>
+            <w:tcW w:type="dxa" w:w="8712"/>
+            <w:vAlign w:val="center"/>
+            <w:tcMar>
+              <w:top w:w="35" w:type="dxa"/>
+              <w:bottom w:w="35" w:type="dxa"/>
+              <w:left w:w="35" w:type="dxa"/>
+              <w:right w:w="35" w:type="dxa"/>
+            </w:tcMar>
+          </w:tcPr>
+          <w:p>
+            <w:pPr>
+              <w:keepLines/>
+              <w:spacing w:before="0" w:after="0" w:line="240" w:lineRule="auto"/>
+              <w:ind w:left="280"/>
+              <w:jc w:val="left"/>
+            </w:pPr>
+            <w:r>
+              <w:rPr>
+                <w:rFonts w:ascii="Times New Roman" w:hAnsi="Times New Roman"/>
+                <w:b w:val="0"/>
+                <w:sz w:val="22"/>
+              </w:rPr>
+              <w:t>1.5. Cấu trúc báo cáo dự kiến</w:t>
+            </w:r>
+          </w:p>
+        </w:tc>
+        <w:tc>
+          <w:tcPr>
+            <w:tcW w:type="dxa" w:w="648"/>
+            <w:vAlign w:val="center"/>
+            <w:tcMar>
+              <w:top w:w="35" w:type="dxa"/>
+              <w:bottom w:w="35" w:type="dxa"/>
+              <w:left w:w="35" w:type="dxa"/>
+              <w:right w:w="35" w:type="dxa"/>
+            </w:tcMar>
+          </w:tcPr>
+          <w:p>
+            <w:pPr>
+              <w:keepLines/>
+              <w:spacing w:before="0" w:after="0" w:line="240" w:lineRule="auto"/>
+              <w:jc w:val="right"/>
+            </w:pPr>
+            <w:r>
+              <w:rPr>
+                <w:rFonts w:ascii="Times New Roman" w:hAnsi="Times New Roman"/>
+                <w:b w:val="0"/>
+                <w:sz w:val="22"/>
+              </w:rPr>
+              <w:t>5</w:t>
+            </w:r>
+          </w:p>
+        </w:tc>
+      </w:tr>
+      <w:tr>
+        <w:trPr>
+          <w:cantSplit/>
+        </w:trPr>
+        <w:tc>
+          <w:tcPr>
+            <w:tcW w:type="dxa" w:w="8712"/>
+            <w:vAlign w:val="center"/>
+            <w:tcMar>
+              <w:top w:w="35" w:type="dxa"/>
+              <w:bottom w:w="35" w:type="dxa"/>
+              <w:left w:w="35" w:type="dxa"/>
+              <w:right w:w="35" w:type="dxa"/>
+            </w:tcMar>
+          </w:tcPr>
+          <w:p>
+            <w:pPr>
+              <w:keepLines/>
+              <w:spacing w:before="60" w:after="0" w:line="240" w:lineRule="auto"/>
+              <w:ind w:left="0"/>
+              <w:jc w:val="left"/>
+            </w:pPr>
+            <w:r>
+              <w:rPr>
+                <w:rFonts w:ascii="Times New Roman" w:hAnsi="Times New Roman"/>
+                <w:b/>
+                <w:color w:val="365F91"/>
+                <w:sz w:val="22"/>
+              </w:rPr>
+              <w:t>CHƯƠNG 2. PHÁT BIỂU BÀI TOÁN</w:t>
+            </w:r>
+          </w:p>
+        </w:tc>
+        <w:tc>
+          <w:tcPr>
+            <w:tcW w:type="dxa" w:w="648"/>
+            <w:vAlign w:val="center"/>
+            <w:tcMar>
+              <w:top w:w="35" w:type="dxa"/>
+              <w:bottom w:w="35" w:type="dxa"/>
+              <w:left w:w="35" w:type="dxa"/>
+              <w:right w:w="35" w:type="dxa"/>
+            </w:tcMar>
+          </w:tcPr>
+          <w:p>
+            <w:pPr>
+              <w:keepLines/>
+              <w:spacing w:before="60" w:after="0" w:line="240" w:lineRule="auto"/>
+              <w:jc w:val="right"/>
+            </w:pPr>
+            <w:r>
+              <w:rPr>
+                <w:rFonts w:ascii="Times New Roman" w:hAnsi="Times New Roman"/>
+                <w:b/>
+                <w:color w:val="365F91"/>
+                <w:sz w:val="22"/>
+              </w:rPr>
+              <w:t>6</w:t>
+            </w:r>
+          </w:p>
+        </w:tc>
+      </w:tr>
+      <w:tr>
+        <w:trPr>
+          <w:cantSplit/>
+        </w:trPr>
+        <w:tc>
+          <w:tcPr>
+            <w:tcW w:type="dxa" w:w="8712"/>
+            <w:vAlign w:val="center"/>
+            <w:tcMar>
+              <w:top w:w="35" w:type="dxa"/>
+              <w:bottom w:w="35" w:type="dxa"/>
+              <w:left w:w="35" w:type="dxa"/>
+              <w:right w:w="35" w:type="dxa"/>
+            </w:tcMar>
+          </w:tcPr>
+          <w:p>
+            <w:pPr>
+              <w:keepLines/>
+              <w:spacing w:before="0" w:after="0" w:line="240" w:lineRule="auto"/>
+              <w:ind w:left="280"/>
+              <w:jc w:val="left"/>
+            </w:pPr>
+            <w:r>
+              <w:rPr>
+                <w:rFonts w:ascii="Times New Roman" w:hAnsi="Times New Roman"/>
+                <w:b w:val="0"/>
+                <w:sz w:val="22"/>
+              </w:rPr>
+              <w:t>2.1. Mô tả bài toán</w:t>
+            </w:r>
+          </w:p>
+        </w:tc>
+        <w:tc>
+          <w:tcPr>
+            <w:tcW w:type="dxa" w:w="648"/>
+            <w:vAlign w:val="center"/>
+            <w:tcMar>
+              <w:top w:w="35" w:type="dxa"/>
+              <w:bottom w:w="35" w:type="dxa"/>
+              <w:left w:w="35" w:type="dxa"/>
+              <w:right w:w="35" w:type="dxa"/>
+            </w:tcMar>
+          </w:tcPr>
+          <w:p>
+            <w:pPr>
+              <w:keepLines/>
+              <w:spacing w:before="0" w:after="0" w:line="240" w:lineRule="auto"/>
+              <w:jc w:val="right"/>
+            </w:pPr>
+            <w:r>
+              <w:rPr>
+                <w:rFonts w:ascii="Times New Roman" w:hAnsi="Times New Roman"/>
+                <w:b w:val="0"/>
+                <w:sz w:val="22"/>
+              </w:rPr>
+              <w:t>6</w:t>
+            </w:r>
+          </w:p>
+        </w:tc>
+      </w:tr>
+      <w:tr>
+        <w:trPr>
+          <w:cantSplit/>
+        </w:trPr>
+        <w:tc>
+          <w:tcPr>
+            <w:tcW w:type="dxa" w:w="8712"/>
+            <w:vAlign w:val="center"/>
+            <w:tcMar>
+              <w:top w:w="35" w:type="dxa"/>
+              <w:bottom w:w="35" w:type="dxa"/>
+              <w:left w:w="35" w:type="dxa"/>
+              <w:right w:w="35" w:type="dxa"/>
+            </w:tcMar>
+          </w:tcPr>
+          <w:p>
+            <w:pPr>
+              <w:keepLines/>
+              <w:spacing w:before="0" w:after="0" w:line="240" w:lineRule="auto"/>
+              <w:ind w:left="280"/>
+              <w:jc w:val="left"/>
+            </w:pPr>
+            <w:r>
+              <w:rPr>
+                <w:rFonts w:ascii="Times New Roman" w:hAnsi="Times New Roman"/>
+                <w:b w:val="0"/>
+                <w:sz w:val="22"/>
+              </w:rPr>
+              <w:t>2.2. Đầu vào và đầu ra</w:t>
+            </w:r>
+          </w:p>
+        </w:tc>
+        <w:tc>
+          <w:tcPr>
+            <w:tcW w:type="dxa" w:w="648"/>
+            <w:vAlign w:val="center"/>
+            <w:tcMar>
+              <w:top w:w="35" w:type="dxa"/>
+              <w:bottom w:w="35" w:type="dxa"/>
+              <w:left w:w="35" w:type="dxa"/>
+              <w:right w:w="35" w:type="dxa"/>
+            </w:tcMar>
+          </w:tcPr>
+          <w:p>
+            <w:pPr>
+              <w:keepLines/>
+              <w:spacing w:before="0" w:after="0" w:line="240" w:lineRule="auto"/>
+              <w:jc w:val="right"/>
+            </w:pPr>
+            <w:r>
+              <w:rPr>
+                <w:rFonts w:ascii="Times New Roman" w:hAnsi="Times New Roman"/>
+                <w:b w:val="0"/>
+                <w:sz w:val="22"/>
+              </w:rPr>
+              <w:t>6</w:t>
+            </w:r>
+          </w:p>
+        </w:tc>
+      </w:tr>
+      <w:tr>
+        <w:trPr>
+          <w:cantSplit/>
+        </w:trPr>
+        <w:tc>
+          <w:tcPr>
+            <w:tcW w:type="dxa" w:w="8712"/>
+            <w:vAlign w:val="center"/>
+            <w:tcMar>
+              <w:top w:w="35" w:type="dxa"/>
+              <w:bottom w:w="35" w:type="dxa"/>
+              <w:left w:w="35" w:type="dxa"/>
+              <w:right w:w="35" w:type="dxa"/>
+            </w:tcMar>
+          </w:tcPr>
+          <w:p>
+            <w:pPr>
+              <w:keepLines/>
+              <w:spacing w:before="0" w:after="0" w:line="240" w:lineRule="auto"/>
+              <w:ind w:left="280"/>
+              <w:jc w:val="left"/>
+            </w:pPr>
+            <w:r>
+              <w:rPr>
+                <w:rFonts w:ascii="Times New Roman" w:hAnsi="Times New Roman"/>
+                <w:b w:val="0"/>
+                <w:sz w:val="22"/>
+              </w:rPr>
+              <w:t>2.3. Các thách thức chính</w:t>
+            </w:r>
+          </w:p>
+        </w:tc>
+        <w:tc>
+          <w:tcPr>
+            <w:tcW w:type="dxa" w:w="648"/>
+            <w:vAlign w:val="center"/>
+            <w:tcMar>
+              <w:top w:w="35" w:type="dxa"/>
+              <w:bottom w:w="35" w:type="dxa"/>
+              <w:left w:w="35" w:type="dxa"/>
+              <w:right w:w="35" w:type="dxa"/>
+            </w:tcMar>
+          </w:tcPr>
+          <w:p>
+            <w:pPr>
+              <w:keepLines/>
+              <w:spacing w:before="0" w:after="0" w:line="240" w:lineRule="auto"/>
+              <w:jc w:val="right"/>
+            </w:pPr>
+            <w:r>
+              <w:rPr>
+                <w:rFonts w:ascii="Times New Roman" w:hAnsi="Times New Roman"/>
+                <w:b w:val="0"/>
+                <w:sz w:val="22"/>
+              </w:rPr>
+              <w:t>7</w:t>
+            </w:r>
+          </w:p>
+        </w:tc>
+      </w:tr>
+      <w:tr>
+        <w:trPr>
+          <w:cantSplit/>
+        </w:trPr>
+        <w:tc>
+          <w:tcPr>
+            <w:tcW w:type="dxa" w:w="8712"/>
+            <w:vAlign w:val="center"/>
+            <w:tcMar>
+              <w:top w:w="35" w:type="dxa"/>
+              <w:bottom w:w="35" w:type="dxa"/>
+              <w:left w:w="35" w:type="dxa"/>
+              <w:right w:w="35" w:type="dxa"/>
+            </w:tcMar>
+          </w:tcPr>
+          <w:p>
+            <w:pPr>
+              <w:keepLines/>
+              <w:spacing w:before="0" w:after="0" w:line="240" w:lineRule="auto"/>
+              <w:ind w:left="280"/>
+              <w:jc w:val="left"/>
+            </w:pPr>
+            <w:r>
+              <w:rPr>
+                <w:rFonts w:ascii="Times New Roman" w:hAnsi="Times New Roman"/>
+                <w:b w:val="0"/>
+                <w:sz w:val="22"/>
+              </w:rPr>
+              <w:t>2.4. Yêu cầu kỹ thuật</w:t>
+            </w:r>
+          </w:p>
+        </w:tc>
+        <w:tc>
+          <w:tcPr>
+            <w:tcW w:type="dxa" w:w="648"/>
+            <w:vAlign w:val="center"/>
+            <w:tcMar>
+              <w:top w:w="35" w:type="dxa"/>
+              <w:bottom w:w="35" w:type="dxa"/>
+              <w:left w:w="35" w:type="dxa"/>
+              <w:right w:w="35" w:type="dxa"/>
+            </w:tcMar>
+          </w:tcPr>
+          <w:p>
+            <w:pPr>
+              <w:keepLines/>
+              <w:spacing w:before="0" w:after="0" w:line="240" w:lineRule="auto"/>
+              <w:jc w:val="right"/>
+            </w:pPr>
+            <w:r>
+              <w:rPr>
+                <w:rFonts w:ascii="Times New Roman" w:hAnsi="Times New Roman"/>
+                <w:b w:val="0"/>
+                <w:sz w:val="22"/>
+              </w:rPr>
+              <w:t>7</w:t>
+            </w:r>
+          </w:p>
+        </w:tc>
+      </w:tr>
+      <w:tr>
+        <w:trPr>
+          <w:cantSplit/>
+        </w:trPr>
+        <w:tc>
+          <w:tcPr>
+            <w:tcW w:type="dxa" w:w="8712"/>
+            <w:vAlign w:val="center"/>
+            <w:tcMar>
+              <w:top w:w="35" w:type="dxa"/>
+              <w:bottom w:w="35" w:type="dxa"/>
+              <w:left w:w="35" w:type="dxa"/>
+              <w:right w:w="35" w:type="dxa"/>
+            </w:tcMar>
+          </w:tcPr>
+          <w:p>
+            <w:pPr>
+              <w:keepLines/>
+              <w:spacing w:before="0" w:after="0" w:line="240" w:lineRule="auto"/>
+              <w:ind w:left="280"/>
+              <w:jc w:val="left"/>
+            </w:pPr>
+            <w:r>
+              <w:rPr>
+                <w:rFonts w:ascii="Times New Roman" w:hAnsi="Times New Roman"/>
+                <w:b w:val="0"/>
+                <w:sz w:val="22"/>
+              </w:rPr>
+              <w:t>2.5. Câu hỏi nghiên cứu</w:t>
+            </w:r>
+          </w:p>
+        </w:tc>
+        <w:tc>
+          <w:tcPr>
+            <w:tcW w:type="dxa" w:w="648"/>
+            <w:vAlign w:val="center"/>
+            <w:tcMar>
+              <w:top w:w="35" w:type="dxa"/>
+              <w:bottom w:w="35" w:type="dxa"/>
+              <w:left w:w="35" w:type="dxa"/>
+              <w:right w:w="35" w:type="dxa"/>
+            </w:tcMar>
+          </w:tcPr>
+          <w:p>
+            <w:pPr>
+              <w:keepLines/>
+              <w:spacing w:before="0" w:after="0" w:line="240" w:lineRule="auto"/>
+              <w:jc w:val="right"/>
+            </w:pPr>
+            <w:r>
+              <w:rPr>
+                <w:rFonts w:ascii="Times New Roman" w:hAnsi="Times New Roman"/>
+                <w:b w:val="0"/>
+                <w:sz w:val="22"/>
+              </w:rPr>
+              <w:t>8</w:t>
+            </w:r>
+          </w:p>
+        </w:tc>
+      </w:tr>
+      <w:tr>
+        <w:trPr>
+          <w:cantSplit/>
+        </w:trPr>
+        <w:tc>
+          <w:tcPr>
+            <w:tcW w:type="dxa" w:w="8712"/>
+            <w:vAlign w:val="center"/>
+            <w:tcMar>
+              <w:top w:w="35" w:type="dxa"/>
+              <w:bottom w:w="35" w:type="dxa"/>
+              <w:left w:w="35" w:type="dxa"/>
+              <w:right w:w="35" w:type="dxa"/>
+            </w:tcMar>
+          </w:tcPr>
+          <w:p>
+            <w:pPr>
+              <w:keepLines/>
+              <w:spacing w:before="60" w:after="0" w:line="240" w:lineRule="auto"/>
+              <w:ind w:left="0"/>
+              <w:jc w:val="left"/>
+            </w:pPr>
+            <w:r>
+              <w:rPr>
+                <w:rFonts w:ascii="Times New Roman" w:hAnsi="Times New Roman"/>
+                <w:b/>
+                <w:color w:val="365F91"/>
+                <w:sz w:val="22"/>
+              </w:rPr>
+              <w:t>CHƯƠNG 3. MÔ TẢ DỮ LIỆU</w:t>
+            </w:r>
+          </w:p>
+        </w:tc>
+        <w:tc>
+          <w:tcPr>
+            <w:tcW w:type="dxa" w:w="648"/>
+            <w:vAlign w:val="center"/>
+            <w:tcMar>
+              <w:top w:w="35" w:type="dxa"/>
+              <w:bottom w:w="35" w:type="dxa"/>
+              <w:left w:w="35" w:type="dxa"/>
+              <w:right w:w="35" w:type="dxa"/>
+            </w:tcMar>
+          </w:tcPr>
+          <w:p>
+            <w:pPr>
+              <w:keepLines/>
+              <w:spacing w:before="60" w:after="0" w:line="240" w:lineRule="auto"/>
+              <w:jc w:val="right"/>
+            </w:pPr>
+            <w:r>
+              <w:rPr>
+                <w:rFonts w:ascii="Times New Roman" w:hAnsi="Times New Roman"/>
+                <w:b/>
+                <w:color w:val="365F91"/>
+                <w:sz w:val="22"/>
+              </w:rPr>
+              <w:t>9</w:t>
+            </w:r>
+          </w:p>
+        </w:tc>
+      </w:tr>
+      <w:tr>
+        <w:trPr>
+          <w:cantSplit/>
+        </w:trPr>
+        <w:tc>
+          <w:tcPr>
+            <w:tcW w:type="dxa" w:w="8712"/>
+            <w:vAlign w:val="center"/>
+            <w:tcMar>
+              <w:top w:w="35" w:type="dxa"/>
+              <w:bottom w:w="35" w:type="dxa"/>
+              <w:left w:w="35" w:type="dxa"/>
+              <w:right w:w="35" w:type="dxa"/>
+            </w:tcMar>
+          </w:tcPr>
+          <w:p>
+            <w:pPr>
+              <w:keepLines/>
+              <w:spacing w:before="0" w:after="0" w:line="240" w:lineRule="auto"/>
+              <w:ind w:left="280"/>
+              <w:jc w:val="left"/>
+            </w:pPr>
+            <w:r>
+              <w:rPr>
+                <w:rFonts w:ascii="Times New Roman" w:hAnsi="Times New Roman"/>
+                <w:b w:val="0"/>
+                <w:sz w:val="22"/>
+              </w:rPr>
+              <w:t>3.1. Nguồn dữ liệu</w:t>
+            </w:r>
+          </w:p>
+        </w:tc>
+        <w:tc>
+          <w:tcPr>
+            <w:tcW w:type="dxa" w:w="648"/>
+            <w:vAlign w:val="center"/>
+            <w:tcMar>
+              <w:top w:w="35" w:type="dxa"/>
+              <w:bottom w:w="35" w:type="dxa"/>
+              <w:left w:w="35" w:type="dxa"/>
+              <w:right w:w="35" w:type="dxa"/>
+            </w:tcMar>
+          </w:tcPr>
+          <w:p>
+            <w:pPr>
+              <w:keepLines/>
+              <w:spacing w:before="0" w:after="0" w:line="240" w:lineRule="auto"/>
+              <w:jc w:val="right"/>
+            </w:pPr>
+            <w:r>
+              <w:rPr>
+                <w:rFonts w:ascii="Times New Roman" w:hAnsi="Times New Roman"/>
+                <w:b w:val="0"/>
+                <w:sz w:val="22"/>
+              </w:rPr>
+              <w:t>9</w:t>
+            </w:r>
+          </w:p>
+        </w:tc>
+      </w:tr>
+      <w:tr>
+        <w:trPr>
+          <w:cantSplit/>
+        </w:trPr>
+        <w:tc>
+          <w:tcPr>
+            <w:tcW w:type="dxa" w:w="8712"/>
+            <w:vAlign w:val="center"/>
+            <w:tcMar>
+              <w:top w:w="35" w:type="dxa"/>
+              <w:bottom w:w="35" w:type="dxa"/>
+              <w:left w:w="35" w:type="dxa"/>
+              <w:right w:w="35" w:type="dxa"/>
+            </w:tcMar>
+          </w:tcPr>
+          <w:p>
+            <w:pPr>
+              <w:keepLines/>
+              <w:spacing w:before="0" w:after="0" w:line="240" w:lineRule="auto"/>
+              <w:ind w:left="280"/>
+              <w:jc w:val="left"/>
+            </w:pPr>
+            <w:r>
+              <w:rPr>
+                <w:rFonts w:ascii="Times New Roman" w:hAnsi="Times New Roman"/>
+                <w:b w:val="0"/>
+                <w:sz w:val="22"/>
+              </w:rPr>
+              <w:t>3.2. Cấu trúc dữ liệu gốc</w:t>
+            </w:r>
+          </w:p>
+        </w:tc>
+        <w:tc>
+          <w:tcPr>
+            <w:tcW w:type="dxa" w:w="648"/>
+            <w:vAlign w:val="center"/>
+            <w:tcMar>
+              <w:top w:w="35" w:type="dxa"/>
+              <w:bottom w:w="35" w:type="dxa"/>
+              <w:left w:w="35" w:type="dxa"/>
+              <w:right w:w="35" w:type="dxa"/>
+            </w:tcMar>
+          </w:tcPr>
+          <w:p>
+            <w:pPr>
+              <w:keepLines/>
+              <w:spacing w:before="0" w:after="0" w:line="240" w:lineRule="auto"/>
+              <w:jc w:val="right"/>
+            </w:pPr>
+            <w:r>
+              <w:rPr>
+                <w:rFonts w:ascii="Times New Roman" w:hAnsi="Times New Roman"/>
+                <w:b w:val="0"/>
+                <w:sz w:val="22"/>
+              </w:rPr>
+              <w:t>9</w:t>
+            </w:r>
+          </w:p>
+        </w:tc>
+      </w:tr>
+      <w:tr>
+        <w:trPr>
+          <w:cantSplit/>
+        </w:trPr>
+        <w:tc>
+          <w:tcPr>
+            <w:tcW w:type="dxa" w:w="8712"/>
+            <w:vAlign w:val="center"/>
+            <w:tcMar>
+              <w:top w:w="35" w:type="dxa"/>
+              <w:bottom w:w="35" w:type="dxa"/>
+              <w:left w:w="35" w:type="dxa"/>
+              <w:right w:w="35" w:type="dxa"/>
+            </w:tcMar>
+          </w:tcPr>
+          <w:p>
+            <w:pPr>
+              <w:keepLines/>
+              <w:spacing w:before="0" w:after="0" w:line="240" w:lineRule="auto"/>
+              <w:ind w:left="280"/>
+              <w:jc w:val="left"/>
+            </w:pPr>
+            <w:r>
+              <w:rPr>
+                <w:rFonts w:ascii="Times New Roman" w:hAnsi="Times New Roman"/>
+                <w:b w:val="0"/>
+                <w:sz w:val="22"/>
+              </w:rPr>
+              <w:t>3.3. Phân bố giao dịch và nhãn</w:t>
+            </w:r>
+          </w:p>
+        </w:tc>
+        <w:tc>
+          <w:tcPr>
+            <w:tcW w:type="dxa" w:w="648"/>
+            <w:vAlign w:val="center"/>
+            <w:tcMar>
+              <w:top w:w="35" w:type="dxa"/>
+              <w:bottom w:w="35" w:type="dxa"/>
+              <w:left w:w="35" w:type="dxa"/>
+              <w:right w:w="35" w:type="dxa"/>
+            </w:tcMar>
+          </w:tcPr>
+          <w:p>
+            <w:pPr>
+              <w:keepLines/>
+              <w:spacing w:before="0" w:after="0" w:line="240" w:lineRule="auto"/>
+              <w:jc w:val="right"/>
+            </w:pPr>
+            <w:r>
+              <w:rPr>
+                <w:rFonts w:ascii="Times New Roman" w:hAnsi="Times New Roman"/>
+                <w:b w:val="0"/>
+                <w:sz w:val="22"/>
+              </w:rPr>
+              <w:t>10</w:t>
+            </w:r>
+          </w:p>
+        </w:tc>
+      </w:tr>
+      <w:tr>
+        <w:trPr>
+          <w:cantSplit/>
+        </w:trPr>
+        <w:tc>
+          <w:tcPr>
+            <w:tcW w:type="dxa" w:w="8712"/>
+            <w:vAlign w:val="center"/>
+            <w:tcMar>
+              <w:top w:w="35" w:type="dxa"/>
+              <w:bottom w:w="35" w:type="dxa"/>
+              <w:left w:w="35" w:type="dxa"/>
+              <w:right w:w="35" w:type="dxa"/>
+            </w:tcMar>
+          </w:tcPr>
+          <w:p>
+            <w:pPr>
+              <w:keepLines/>
+              <w:spacing w:before="0" w:after="0" w:line="240" w:lineRule="auto"/>
+              <w:ind w:left="280"/>
+              <w:jc w:val="left"/>
+            </w:pPr>
+            <w:r>
+              <w:rPr>
+                <w:rFonts w:ascii="Times New Roman" w:hAnsi="Times New Roman"/>
+                <w:b w:val="0"/>
+                <w:sz w:val="22"/>
+              </w:rPr>
+              <w:t>3.4. Downsampling và chia tập</w:t>
+            </w:r>
+          </w:p>
+        </w:tc>
+        <w:tc>
+          <w:tcPr>
+            <w:tcW w:type="dxa" w:w="648"/>
+            <w:vAlign w:val="center"/>
+            <w:tcMar>
+              <w:top w:w="35" w:type="dxa"/>
+              <w:bottom w:w="35" w:type="dxa"/>
+              <w:left w:w="35" w:type="dxa"/>
+              <w:right w:w="35" w:type="dxa"/>
+            </w:tcMar>
+          </w:tcPr>
+          <w:p>
+            <w:pPr>
+              <w:keepLines/>
+              <w:spacing w:before="0" w:after="0" w:line="240" w:lineRule="auto"/>
+              <w:jc w:val="right"/>
+            </w:pPr>
+            <w:r>
+              <w:rPr>
+                <w:rFonts w:ascii="Times New Roman" w:hAnsi="Times New Roman"/>
+                <w:b w:val="0"/>
+                <w:sz w:val="22"/>
+              </w:rPr>
+              <w:t>10</w:t>
+            </w:r>
+          </w:p>
+        </w:tc>
+      </w:tr>
+      <w:tr>
+        <w:trPr>
+          <w:cantSplit/>
+        </w:trPr>
+        <w:tc>
+          <w:tcPr>
+            <w:tcW w:type="dxa" w:w="8712"/>
+            <w:vAlign w:val="center"/>
+            <w:tcMar>
+              <w:top w:w="35" w:type="dxa"/>
+              <w:bottom w:w="35" w:type="dxa"/>
+              <w:left w:w="35" w:type="dxa"/>
+              <w:right w:w="35" w:type="dxa"/>
+            </w:tcMar>
+          </w:tcPr>
+          <w:p>
+            <w:pPr>
+              <w:keepLines/>
+              <w:spacing w:before="0" w:after="0" w:line="240" w:lineRule="auto"/>
+              <w:ind w:left="280"/>
+              <w:jc w:val="left"/>
+            </w:pPr>
+            <w:r>
+              <w:rPr>
+                <w:rFonts w:ascii="Times New Roman" w:hAnsi="Times New Roman"/>
+                <w:b w:val="0"/>
+                <w:sz w:val="22"/>
+              </w:rPr>
+              <w:t>3.5. Các đặc trưng sau Phase 01</w:t>
+            </w:r>
+          </w:p>
+        </w:tc>
+        <w:tc>
+          <w:tcPr>
+            <w:tcW w:type="dxa" w:w="648"/>
+            <w:vAlign w:val="center"/>
+            <w:tcMar>
+              <w:top w:w="35" w:type="dxa"/>
+              <w:bottom w:w="35" w:type="dxa"/>
+              <w:left w:w="35" w:type="dxa"/>
+              <w:right w:w="35" w:type="dxa"/>
+            </w:tcMar>
+          </w:tcPr>
+          <w:p>
+            <w:pPr>
+              <w:keepLines/>
+              <w:spacing w:before="0" w:after="0" w:line="240" w:lineRule="auto"/>
+              <w:jc w:val="right"/>
+            </w:pPr>
+            <w:r>
+              <w:rPr>
+                <w:rFonts w:ascii="Times New Roman" w:hAnsi="Times New Roman"/>
+                <w:b w:val="0"/>
+                <w:sz w:val="22"/>
+              </w:rPr>
+              <w:t>10</w:t>
+            </w:r>
+          </w:p>
+        </w:tc>
+      </w:tr>
+      <w:tr>
+        <w:trPr>
+          <w:cantSplit/>
+        </w:trPr>
+        <w:tc>
+          <w:tcPr>
+            <w:tcW w:type="dxa" w:w="8712"/>
+            <w:vAlign w:val="center"/>
+            <w:tcMar>
+              <w:top w:w="35" w:type="dxa"/>
+              <w:bottom w:w="35" w:type="dxa"/>
+              <w:left w:w="35" w:type="dxa"/>
+              <w:right w:w="35" w:type="dxa"/>
+            </w:tcMar>
+          </w:tcPr>
+          <w:p>
+            <w:pPr>
+              <w:keepLines/>
+              <w:spacing w:before="0" w:after="0" w:line="240" w:lineRule="auto"/>
+              <w:ind w:left="280"/>
+              <w:jc w:val="left"/>
+            </w:pPr>
+            <w:r>
+              <w:rPr>
+                <w:rFonts w:ascii="Times New Roman" w:hAnsi="Times New Roman"/>
+                <w:b w:val="0"/>
+                <w:sz w:val="22"/>
+              </w:rPr>
+              <w:t>3.6. Hạn chế và nguy cơ ảnh hưởng tính hợp lệ</w:t>
+            </w:r>
+          </w:p>
+        </w:tc>
+        <w:tc>
+          <w:tcPr>
+            <w:tcW w:type="dxa" w:w="648"/>
+            <w:vAlign w:val="center"/>
+            <w:tcMar>
+              <w:top w:w="35" w:type="dxa"/>
+              <w:bottom w:w="35" w:type="dxa"/>
+              <w:left w:w="35" w:type="dxa"/>
+              <w:right w:w="35" w:type="dxa"/>
+            </w:tcMar>
+          </w:tcPr>
+          <w:p>
+            <w:pPr>
+              <w:keepLines/>
+              <w:spacing w:before="0" w:after="0" w:line="240" w:lineRule="auto"/>
+              <w:jc w:val="right"/>
+            </w:pPr>
+            <w:r>
+              <w:rPr>
+                <w:rFonts w:ascii="Times New Roman" w:hAnsi="Times New Roman"/>
+                <w:b w:val="0"/>
+                <w:sz w:val="22"/>
+              </w:rPr>
+              <w:t>11</w:t>
+            </w:r>
+          </w:p>
+        </w:tc>
+      </w:tr>
+      <w:tr>
+        <w:trPr>
+          <w:cantSplit/>
+        </w:trPr>
+        <w:tc>
+          <w:tcPr>
+            <w:tcW w:type="dxa" w:w="8712"/>
+            <w:vAlign w:val="center"/>
+            <w:tcMar>
+              <w:top w:w="35" w:type="dxa"/>
+              <w:bottom w:w="35" w:type="dxa"/>
+              <w:left w:w="35" w:type="dxa"/>
+              <w:right w:w="35" w:type="dxa"/>
+            </w:tcMar>
+          </w:tcPr>
+          <w:p>
+            <w:pPr>
+              <w:keepLines/>
+              <w:spacing w:before="0" w:after="0" w:line="240" w:lineRule="auto"/>
+              <w:ind w:left="280"/>
+              <w:jc w:val="left"/>
+            </w:pPr>
+            <w:r>
+              <w:rPr>
+                <w:rFonts w:ascii="Times New Roman" w:hAnsi="Times New Roman"/>
+                <w:b w:val="0"/>
+                <w:sz w:val="22"/>
+              </w:rPr>
+              <w:t>3.7. Kết luận chương</w:t>
+            </w:r>
+          </w:p>
+        </w:tc>
+        <w:tc>
+          <w:tcPr>
+            <w:tcW w:type="dxa" w:w="648"/>
+            <w:vAlign w:val="center"/>
+            <w:tcMar>
+              <w:top w:w="35" w:type="dxa"/>
+              <w:bottom w:w="35" w:type="dxa"/>
+              <w:left w:w="35" w:type="dxa"/>
+              <w:right w:w="35" w:type="dxa"/>
+            </w:tcMar>
+          </w:tcPr>
+          <w:p>
+            <w:pPr>
+              <w:keepLines/>
+              <w:spacing w:before="0" w:after="0" w:line="240" w:lineRule="auto"/>
+              <w:jc w:val="right"/>
+            </w:pPr>
+            <w:r>
+              <w:rPr>
+                <w:rFonts w:ascii="Times New Roman" w:hAnsi="Times New Roman"/>
+                <w:b w:val="0"/>
+                <w:sz w:val="22"/>
+              </w:rPr>
+              <w:t>12</w:t>
+            </w:r>
+          </w:p>
+        </w:tc>
+      </w:tr>
+      <w:tr>
+        <w:trPr>
+          <w:cantSplit/>
+        </w:trPr>
+        <w:tc>
+          <w:tcPr>
+            <w:tcW w:type="dxa" w:w="8712"/>
+            <w:vAlign w:val="center"/>
+            <w:tcMar>
+              <w:top w:w="35" w:type="dxa"/>
+              <w:bottom w:w="35" w:type="dxa"/>
+              <w:left w:w="35" w:type="dxa"/>
+              <w:right w:w="35" w:type="dxa"/>
+            </w:tcMar>
+          </w:tcPr>
+          <w:p>
+            <w:pPr>
+              <w:keepLines/>
+              <w:spacing w:before="60" w:after="0" w:line="240" w:lineRule="auto"/>
+              <w:ind w:left="0"/>
+              <w:jc w:val="left"/>
+            </w:pPr>
+            <w:r>
+              <w:rPr>
+                <w:rFonts w:ascii="Times New Roman" w:hAnsi="Times New Roman"/>
+                <w:b/>
+                <w:color w:val="365F91"/>
+                <w:sz w:val="22"/>
+              </w:rPr>
+              <w:t>TÀI LIỆU THAM KHẢO TẠM THỜI</w:t>
+            </w:r>
+          </w:p>
+        </w:tc>
+        <w:tc>
+          <w:tcPr>
+            <w:tcW w:type="dxa" w:w="648"/>
+            <w:vAlign w:val="center"/>
+            <w:tcMar>
+              <w:top w:w="35" w:type="dxa"/>
+              <w:bottom w:w="35" w:type="dxa"/>
+              <w:left w:w="35" w:type="dxa"/>
+              <w:right w:w="35" w:type="dxa"/>
+            </w:tcMar>
+          </w:tcPr>
+          <w:p>
+            <w:pPr>
+              <w:keepLines/>
+              <w:spacing w:before="60" w:after="0" w:line="240" w:lineRule="auto"/>
+              <w:jc w:val="right"/>
+            </w:pPr>
+            <w:r>
+              <w:rPr>
+                <w:rFonts w:ascii="Times New Roman" w:hAnsi="Times New Roman"/>
+                <w:b/>
+                <w:color w:val="365F91"/>
+                <w:sz w:val="22"/>
+              </w:rPr>
+              <w:t>13</w:t>
+            </w:r>
+          </w:p>
+        </w:tc>
+      </w:tr>
+    </w:tbl>
     <w:p>
       <w:pPr>
         <w:ind w:firstLine="567"/>
@@ -4260,23 +5511,40 @@
         <w:pStyle w:val="Heading2"/>
       </w:pPr>
       <w:r>
-        <w:rPr>
-          <w:rFonts w:ascii="Times New Roman" w:hAnsi="Times New Roman" w:eastAsia="Times New Roman"/>
-        </w:rPr>
-        <w:t>Sources</w:t>
+        <w:t>Tài liệu bên ngoài</w:t>
       </w:r>
     </w:p>
     <w:p>
       <w:pPr>
         <w:pStyle w:val="ReportBody"/>
-        <w:ind w:firstLine="567"/>
-        <w:jc w:val="both"/>
+        <w:spacing w:after="100" w:line="276" w:lineRule="auto"/>
+        <w:ind w:left="432" w:hanging="432"/>
+        <w:jc w:val="left"/>
       </w:pPr>
       <w:r>
-        <w:rPr>
-          <w:rFonts w:ascii="Times New Roman" w:hAnsi="Times New Roman" w:eastAsia="Times New Roman"/>
-        </w:rPr>
-        <w:t>[1] https://doi.org/10.1016/j.jnca.2016.04.007 — Fraud detection system: A survey [2] https://www.msc-les.org/proceedings/emss/2016/EMSS2016_249.pdf — PaySim: A Financial Mobile Money Simulator for Fraud Detection [3] https://www.kaggle.com/datasets/ealaxi/paysim1 — Synthetic Financial Datasets for Fraud Detection</w:t>
+        <w:t>[1] https://doi.org/10.1016/j.jnca.2016.04.007 — Fraud detection system: A survey.</w:t>
+      </w:r>
+    </w:p>
+    <w:p>
+      <w:pPr>
+        <w:pStyle w:val="ReportBody"/>
+        <w:spacing w:after="100" w:line="276" w:lineRule="auto"/>
+        <w:ind w:left="432" w:hanging="432"/>
+        <w:jc w:val="left"/>
+      </w:pPr>
+      <w:r>
+        <w:t>[2] https://www.msc-les.org/proceedings/emss/2016/EMSS2016_249.pdf — PaySim: A Financial Mobile Money Simulator for Fraud Detection.</w:t>
+      </w:r>
+    </w:p>
+    <w:p>
+      <w:pPr>
+        <w:pStyle w:val="ReportBody"/>
+        <w:spacing w:after="100" w:line="276" w:lineRule="auto"/>
+        <w:ind w:left="432" w:hanging="432"/>
+        <w:jc w:val="left"/>
+      </w:pPr>
+      <w:r>
+        <w:t>[3] https://www.kaggle.com/datasets/ealaxi/paysim1 — Synthetic Financial Datasets for Fraud Detection.</w:t>
       </w:r>
     </w:p>
     <w:sectPr>

</xml_diff>